<commit_message>
Explored final recommended research.
</commit_message>
<xml_diff>
--- a/research.docx
+++ b/research.docx
@@ -1705,7 +1705,7 @@
           <w:szCs w:val="22"/>
         </w:rPr>
         <w:drawing>
-          <wp:inline distT="0" distB="0" distL="0" distR="0" wp14:anchorId="2FF98D18" wp14:editId="3E9B10A0">
+          <wp:inline distT="0" distB="0" distL="0" distR="0" wp14:anchorId="2FF98D18" wp14:editId="47CB3E11">
             <wp:extent cx="4206240" cy="1426468"/>
             <wp:effectExtent l="0" t="0" r="0" b="0"/>
             <wp:docPr id="1164986002" name="Picture 5" descr="A math problem with numbers and equations&#10;&#10;Description automatically generated with medium confidence"/>
@@ -2583,7 +2583,7 @@
           <w:szCs w:val="22"/>
         </w:rPr>
         <w:drawing>
-          <wp:anchor distT="0" distB="0" distL="114300" distR="114300" simplePos="0" relativeHeight="251658240" behindDoc="0" locked="0" layoutInCell="1" allowOverlap="1" wp14:anchorId="51153E31" wp14:editId="3FF53FBD">
+          <wp:anchor distT="0" distB="0" distL="114300" distR="114300" simplePos="0" relativeHeight="251658240" behindDoc="0" locked="0" layoutInCell="1" allowOverlap="1" wp14:anchorId="51153E31" wp14:editId="2D0584FA">
             <wp:simplePos x="1143000" y="3174023"/>
             <wp:positionH relativeFrom="column">
               <wp:align>left</wp:align>
@@ -2726,7 +2726,7 @@
           <w:szCs w:val="22"/>
         </w:rPr>
         <w:drawing>
-          <wp:anchor distT="0" distB="0" distL="114300" distR="114300" simplePos="0" relativeHeight="251659264" behindDoc="0" locked="0" layoutInCell="1" allowOverlap="1" wp14:anchorId="21BBFE6D" wp14:editId="1BD7C6E0">
+          <wp:anchor distT="0" distB="0" distL="114300" distR="114300" simplePos="0" relativeHeight="251659264" behindDoc="0" locked="0" layoutInCell="1" allowOverlap="1" wp14:anchorId="21BBFE6D" wp14:editId="03ECC31B">
             <wp:simplePos x="1143000" y="6093069"/>
             <wp:positionH relativeFrom="column">
               <wp:align>left</wp:align>
@@ -3066,6 +3066,680 @@
     </w:p>
     <w:p>
       <w:pPr>
+        <w:pStyle w:val="ListParagraph"/>
+        <w:tabs>
+          <w:tab w:val="left" w:pos="1842"/>
+        </w:tabs>
+        <w:rPr>
+          <w:sz w:val="22"/>
+          <w:szCs w:val="22"/>
+        </w:rPr>
+      </w:pPr>
+    </w:p>
+    <w:p>
+      <w:pPr>
+        <w:pStyle w:val="ListParagraph"/>
+        <w:numPr>
+          <w:ilvl w:val="0"/>
+          <w:numId w:val="1"/>
+        </w:numPr>
+        <w:tabs>
+          <w:tab w:val="left" w:pos="1842"/>
+        </w:tabs>
+        <w:rPr>
+          <w:sz w:val="22"/>
+          <w:szCs w:val="22"/>
+        </w:rPr>
+      </w:pPr>
+      <w:r>
+        <w:rPr>
+          <w:sz w:val="22"/>
+          <w:szCs w:val="22"/>
+        </w:rPr>
+        <w:t xml:space="preserve">Nanda, S., </w:t>
+      </w:r>
+      <w:proofErr w:type="spellStart"/>
+      <w:r>
+        <w:rPr>
+          <w:sz w:val="22"/>
+          <w:szCs w:val="22"/>
+        </w:rPr>
+        <w:t>Mahanty</w:t>
+      </w:r>
+      <w:proofErr w:type="spellEnd"/>
+      <w:r>
+        <w:rPr>
+          <w:sz w:val="22"/>
+          <w:szCs w:val="22"/>
+        </w:rPr>
+        <w:t>, B. and Tiwari, M. (2010). Clustering Indian stock market data for portfolio management. Expert Systems with Applications, 37(12), pp.8793-8798.</w:t>
+      </w:r>
+    </w:p>
+    <w:p>
+      <w:pPr>
+        <w:pStyle w:val="ListParagraph"/>
+        <w:numPr>
+          <w:ilvl w:val="0"/>
+          <w:numId w:val="2"/>
+        </w:numPr>
+        <w:tabs>
+          <w:tab w:val="left" w:pos="1842"/>
+        </w:tabs>
+        <w:rPr>
+          <w:sz w:val="22"/>
+          <w:szCs w:val="22"/>
+        </w:rPr>
+      </w:pPr>
+      <w:r>
+        <w:rPr>
+          <w:i/>
+          <w:iCs/>
+          <w:sz w:val="22"/>
+          <w:szCs w:val="22"/>
+        </w:rPr>
+        <w:t>K</w:t>
+      </w:r>
+      <w:r>
+        <w:rPr>
+          <w:sz w:val="22"/>
+          <w:szCs w:val="22"/>
+        </w:rPr>
+        <w:t>-means cluster analysis builds the most compact clusters as compared to SOM and Fuzzy </w:t>
+      </w:r>
+      <w:r>
+        <w:rPr>
+          <w:i/>
+          <w:iCs/>
+          <w:sz w:val="22"/>
+          <w:szCs w:val="22"/>
+        </w:rPr>
+        <w:t>C</w:t>
+      </w:r>
+      <w:r>
+        <w:rPr>
+          <w:sz w:val="22"/>
+          <w:szCs w:val="22"/>
+        </w:rPr>
+        <w:t>-means for stock classification data.</w:t>
+      </w:r>
+    </w:p>
+    <w:p>
+      <w:pPr>
+        <w:pStyle w:val="ListParagraph"/>
+        <w:numPr>
+          <w:ilvl w:val="0"/>
+          <w:numId w:val="2"/>
+        </w:numPr>
+        <w:tabs>
+          <w:tab w:val="left" w:pos="1842"/>
+        </w:tabs>
+        <w:rPr>
+          <w:sz w:val="22"/>
+          <w:szCs w:val="22"/>
+        </w:rPr>
+      </w:pPr>
+      <w:r>
+        <w:rPr>
+          <w:sz w:val="22"/>
+          <w:szCs w:val="22"/>
+        </w:rPr>
+        <w:t>A model of creating efficient portfolio was developed by </w:t>
+      </w:r>
+      <w:bookmarkStart w:id="8" w:name="bbib18"/>
+      <w:r>
+        <w:rPr>
+          <w:sz w:val="22"/>
+          <w:szCs w:val="22"/>
+        </w:rPr>
+        <w:fldChar w:fldCharType="begin"/>
+      </w:r>
+      <w:r>
+        <w:rPr>
+          <w:sz w:val="22"/>
+          <w:szCs w:val="22"/>
+        </w:rPr>
+        <w:instrText>HYPERLINK "https://www.sciencedirect.com/science/article/pii/S0957417410005300" \l "bib18"</w:instrText>
+      </w:r>
+      <w:r>
+        <w:rPr>
+          <w:sz w:val="22"/>
+          <w:szCs w:val="22"/>
+        </w:rPr>
+      </w:r>
+      <w:r>
+        <w:rPr>
+          <w:sz w:val="22"/>
+          <w:szCs w:val="22"/>
+        </w:rPr>
+        <w:fldChar w:fldCharType="separate"/>
+      </w:r>
+      <w:r>
+        <w:rPr>
+          <w:rStyle w:val="Hyperlink"/>
+          <w:sz w:val="22"/>
+          <w:szCs w:val="22"/>
+        </w:rPr>
+        <w:t>Markowitz (1952)</w:t>
+      </w:r>
+      <w:r>
+        <w:rPr>
+          <w:sz w:val="22"/>
+          <w:szCs w:val="22"/>
+        </w:rPr>
+        <w:fldChar w:fldCharType="end"/>
+      </w:r>
+      <w:bookmarkEnd w:id="8"/>
+      <w:r>
+        <w:rPr>
+          <w:sz w:val="22"/>
+          <w:szCs w:val="22"/>
+        </w:rPr>
+        <w:t xml:space="preserve">. In the Markowitz model, the return of a stock is the mean </w:t>
+      </w:r>
+      <w:proofErr w:type="gramStart"/>
+      <w:r>
+        <w:rPr>
+          <w:sz w:val="22"/>
+          <w:szCs w:val="22"/>
+        </w:rPr>
+        <w:t>return</w:t>
+      </w:r>
+      <w:proofErr w:type="gramEnd"/>
+      <w:r>
+        <w:rPr>
+          <w:sz w:val="22"/>
+          <w:szCs w:val="22"/>
+        </w:rPr>
+        <w:t xml:space="preserve"> and the risk of a stock is the standard deviation of the stock returns. The portfolio return is the weighted returns of stocks. The efficient frontier of portfolios is the set of portfolios that offer the greatest return for each level risk (or equivalently, portfolios with the lowest risk for a given level of return). Investors measure risk reduction by diversification of investment.</w:t>
+      </w:r>
+    </w:p>
+    <w:p>
+      <w:pPr>
+        <w:pStyle w:val="ListParagraph"/>
+        <w:numPr>
+          <w:ilvl w:val="0"/>
+          <w:numId w:val="2"/>
+        </w:numPr>
+        <w:tabs>
+          <w:tab w:val="left" w:pos="1842"/>
+        </w:tabs>
+        <w:rPr>
+          <w:sz w:val="22"/>
+          <w:szCs w:val="22"/>
+        </w:rPr>
+      </w:pPr>
+      <w:r>
+        <w:rPr>
+          <w:sz w:val="22"/>
+          <w:szCs w:val="22"/>
+        </w:rPr>
+        <w:t>From the literatures reviewed we could see that there are very few studies on clustering stock data but there have been a lot of work for portfolio optimization. </w:t>
+      </w:r>
+    </w:p>
+    <w:p>
+      <w:pPr>
+        <w:pStyle w:val="ListParagraph"/>
+        <w:numPr>
+          <w:ilvl w:val="0"/>
+          <w:numId w:val="2"/>
+        </w:numPr>
+        <w:tabs>
+          <w:tab w:val="left" w:pos="1842"/>
+        </w:tabs>
+        <w:rPr>
+          <w:sz w:val="22"/>
+          <w:szCs w:val="22"/>
+        </w:rPr>
+      </w:pPr>
+      <w:r>
+        <w:rPr>
+          <w:sz w:val="22"/>
+          <w:szCs w:val="22"/>
+        </w:rPr>
+        <w:t>Fuzzy </w:t>
+      </w:r>
+      <w:r>
+        <w:rPr>
+          <w:i/>
+          <w:iCs/>
+          <w:sz w:val="22"/>
+          <w:szCs w:val="22"/>
+        </w:rPr>
+        <w:t>C</w:t>
+      </w:r>
+      <w:r>
+        <w:rPr>
+          <w:sz w:val="22"/>
+          <w:szCs w:val="22"/>
+        </w:rPr>
+        <w:t>-means was a development by </w:t>
+      </w:r>
+      <w:bookmarkStart w:id="9" w:name="bbib3"/>
+      <w:proofErr w:type="spellStart"/>
+      <w:r>
+        <w:rPr>
+          <w:sz w:val="22"/>
+          <w:szCs w:val="22"/>
+        </w:rPr>
+        <w:fldChar w:fldCharType="begin"/>
+      </w:r>
+      <w:r>
+        <w:rPr>
+          <w:sz w:val="22"/>
+          <w:szCs w:val="22"/>
+        </w:rPr>
+        <w:instrText>HYPERLINK "https://www.sciencedirect.com/science/article/pii/S0957417410005300" \l "bib3"</w:instrText>
+      </w:r>
+      <w:r>
+        <w:rPr>
+          <w:sz w:val="22"/>
+          <w:szCs w:val="22"/>
+        </w:rPr>
+      </w:r>
+      <w:r>
+        <w:rPr>
+          <w:sz w:val="22"/>
+          <w:szCs w:val="22"/>
+        </w:rPr>
+        <w:fldChar w:fldCharType="separate"/>
+      </w:r>
+      <w:r>
+        <w:rPr>
+          <w:rStyle w:val="Hyperlink"/>
+          <w:sz w:val="22"/>
+          <w:szCs w:val="22"/>
+        </w:rPr>
+        <w:t>Bezdek</w:t>
+      </w:r>
+      <w:proofErr w:type="spellEnd"/>
+      <w:r>
+        <w:rPr>
+          <w:rStyle w:val="Hyperlink"/>
+          <w:sz w:val="22"/>
+          <w:szCs w:val="22"/>
+        </w:rPr>
+        <w:t xml:space="preserve"> (1981)</w:t>
+      </w:r>
+      <w:r>
+        <w:rPr>
+          <w:sz w:val="22"/>
+          <w:szCs w:val="22"/>
+        </w:rPr>
+        <w:fldChar w:fldCharType="end"/>
+      </w:r>
+      <w:bookmarkEnd w:id="9"/>
+      <w:r>
+        <w:rPr>
+          <w:sz w:val="22"/>
+          <w:szCs w:val="22"/>
+        </w:rPr>
+        <w:t xml:space="preserve">. </w:t>
+      </w:r>
+      <w:r>
+        <w:rPr>
+          <w:sz w:val="22"/>
+          <w:szCs w:val="22"/>
+        </w:rPr>
+        <w:t>The Fuzzy </w:t>
+      </w:r>
+      <w:r>
+        <w:rPr>
+          <w:i/>
+          <w:iCs/>
+          <w:sz w:val="22"/>
+          <w:szCs w:val="22"/>
+        </w:rPr>
+        <w:t>C</w:t>
+      </w:r>
+      <w:r>
+        <w:rPr>
+          <w:sz w:val="22"/>
+          <w:szCs w:val="22"/>
+        </w:rPr>
+        <w:t>-means clustering algorithm is a variation of the </w:t>
+      </w:r>
+      <w:r>
+        <w:rPr>
+          <w:i/>
+          <w:iCs/>
+          <w:sz w:val="22"/>
+          <w:szCs w:val="22"/>
+        </w:rPr>
+        <w:t>K</w:t>
+      </w:r>
+      <w:r>
+        <w:rPr>
+          <w:sz w:val="22"/>
+          <w:szCs w:val="22"/>
+        </w:rPr>
+        <w:t>-means clustering algorithm, in which a degree of membership of clusters is incorporated for each data point.</w:t>
+      </w:r>
+    </w:p>
+    <w:p>
+      <w:pPr>
+        <w:pStyle w:val="ListParagraph"/>
+        <w:numPr>
+          <w:ilvl w:val="0"/>
+          <w:numId w:val="2"/>
+        </w:numPr>
+        <w:tabs>
+          <w:tab w:val="left" w:pos="1842"/>
+        </w:tabs>
+        <w:rPr>
+          <w:sz w:val="22"/>
+          <w:szCs w:val="22"/>
+        </w:rPr>
+      </w:pPr>
+      <w:r>
+        <w:rPr>
+          <w:sz w:val="22"/>
+          <w:szCs w:val="22"/>
+        </w:rPr>
+        <w:t xml:space="preserve">Other popular clustering techniques use artificial neural networks for data clustering and one of the most popular is </w:t>
+      </w:r>
+      <w:proofErr w:type="spellStart"/>
+      <w:r>
+        <w:rPr>
+          <w:sz w:val="22"/>
+          <w:szCs w:val="22"/>
+        </w:rPr>
+        <w:t>self organizing</w:t>
+      </w:r>
+      <w:proofErr w:type="spellEnd"/>
+      <w:r>
+        <w:rPr>
+          <w:sz w:val="22"/>
+          <w:szCs w:val="22"/>
+        </w:rPr>
+        <w:t xml:space="preserve"> maps (SOM).</w:t>
+      </w:r>
+    </w:p>
+    <w:p>
+      <w:pPr>
+        <w:pStyle w:val="ListParagraph"/>
+        <w:numPr>
+          <w:ilvl w:val="0"/>
+          <w:numId w:val="2"/>
+        </w:numPr>
+        <w:tabs>
+          <w:tab w:val="left" w:pos="1842"/>
+        </w:tabs>
+        <w:rPr>
+          <w:sz w:val="22"/>
+          <w:szCs w:val="22"/>
+        </w:rPr>
+      </w:pPr>
+      <w:r>
+        <w:rPr>
+          <w:sz w:val="22"/>
+          <w:szCs w:val="22"/>
+        </w:rPr>
+        <w:t>There are papers showing comparison of different clustering methods (</w:t>
+      </w:r>
+      <w:bookmarkStart w:id="10" w:name="bbib5"/>
+      <w:proofErr w:type="spellStart"/>
+      <w:r>
+        <w:rPr>
+          <w:sz w:val="22"/>
+          <w:szCs w:val="22"/>
+        </w:rPr>
+        <w:fldChar w:fldCharType="begin"/>
+      </w:r>
+      <w:r>
+        <w:rPr>
+          <w:sz w:val="22"/>
+          <w:szCs w:val="22"/>
+        </w:rPr>
+        <w:instrText>HYPERLINK "https://www.sciencedirect.com/science/article/pii/S0957417410005300" \l "bib5"</w:instrText>
+      </w:r>
+      <w:r>
+        <w:rPr>
+          <w:sz w:val="22"/>
+          <w:szCs w:val="22"/>
+        </w:rPr>
+      </w:r>
+      <w:r>
+        <w:rPr>
+          <w:sz w:val="22"/>
+          <w:szCs w:val="22"/>
+        </w:rPr>
+        <w:fldChar w:fldCharType="separate"/>
+      </w:r>
+      <w:r>
+        <w:rPr>
+          <w:rStyle w:val="Hyperlink"/>
+          <w:sz w:val="22"/>
+          <w:szCs w:val="22"/>
+        </w:rPr>
+        <w:t>Budayan</w:t>
+      </w:r>
+      <w:proofErr w:type="spellEnd"/>
+      <w:r>
+        <w:rPr>
+          <w:rStyle w:val="Hyperlink"/>
+          <w:sz w:val="22"/>
+          <w:szCs w:val="22"/>
+        </w:rPr>
+        <w:t xml:space="preserve"> et al., 2009</w:t>
+      </w:r>
+      <w:r>
+        <w:rPr>
+          <w:sz w:val="22"/>
+          <w:szCs w:val="22"/>
+        </w:rPr>
+        <w:fldChar w:fldCharType="end"/>
+      </w:r>
+      <w:bookmarkEnd w:id="10"/>
+      <w:r>
+        <w:rPr>
+          <w:sz w:val="22"/>
+          <w:szCs w:val="22"/>
+        </w:rPr>
+        <w:t>, </w:t>
+      </w:r>
+      <w:bookmarkStart w:id="11" w:name="bbib9"/>
+      <w:proofErr w:type="spellStart"/>
+      <w:r>
+        <w:rPr>
+          <w:sz w:val="22"/>
+          <w:szCs w:val="22"/>
+        </w:rPr>
+        <w:fldChar w:fldCharType="begin"/>
+      </w:r>
+      <w:r>
+        <w:rPr>
+          <w:sz w:val="22"/>
+          <w:szCs w:val="22"/>
+        </w:rPr>
+        <w:instrText>HYPERLINK "https://www.sciencedirect.com/science/article/pii/S0957417410005300" \l "bib9"</w:instrText>
+      </w:r>
+      <w:r>
+        <w:rPr>
+          <w:sz w:val="22"/>
+          <w:szCs w:val="22"/>
+        </w:rPr>
+      </w:r>
+      <w:r>
+        <w:rPr>
+          <w:sz w:val="22"/>
+          <w:szCs w:val="22"/>
+        </w:rPr>
+        <w:fldChar w:fldCharType="separate"/>
+      </w:r>
+      <w:r>
+        <w:rPr>
+          <w:rStyle w:val="Hyperlink"/>
+          <w:sz w:val="22"/>
+          <w:szCs w:val="22"/>
+        </w:rPr>
+        <w:t>Delibasis</w:t>
+      </w:r>
+      <w:proofErr w:type="spellEnd"/>
+      <w:r>
+        <w:rPr>
+          <w:rStyle w:val="Hyperlink"/>
+          <w:sz w:val="22"/>
+          <w:szCs w:val="22"/>
+        </w:rPr>
+        <w:t xml:space="preserve"> et al., 1999</w:t>
+      </w:r>
+      <w:r>
+        <w:rPr>
+          <w:sz w:val="22"/>
+          <w:szCs w:val="22"/>
+        </w:rPr>
+        <w:fldChar w:fldCharType="end"/>
+      </w:r>
+      <w:bookmarkEnd w:id="11"/>
+      <w:r>
+        <w:rPr>
+          <w:sz w:val="22"/>
+          <w:szCs w:val="22"/>
+        </w:rPr>
+        <w:t>, </w:t>
+      </w:r>
+      <w:bookmarkStart w:id="12" w:name="bbib20"/>
+      <w:proofErr w:type="spellStart"/>
+      <w:r>
+        <w:rPr>
+          <w:sz w:val="22"/>
+          <w:szCs w:val="22"/>
+        </w:rPr>
+        <w:fldChar w:fldCharType="begin"/>
+      </w:r>
+      <w:r>
+        <w:rPr>
+          <w:sz w:val="22"/>
+          <w:szCs w:val="22"/>
+        </w:rPr>
+        <w:instrText>HYPERLINK "https://www.sciencedirect.com/science/article/pii/S0957417410005300" \l "bib20"</w:instrText>
+      </w:r>
+      <w:r>
+        <w:rPr>
+          <w:sz w:val="22"/>
+          <w:szCs w:val="22"/>
+        </w:rPr>
+      </w:r>
+      <w:r>
+        <w:rPr>
+          <w:sz w:val="22"/>
+          <w:szCs w:val="22"/>
+        </w:rPr>
+        <w:fldChar w:fldCharType="separate"/>
+      </w:r>
+      <w:r>
+        <w:rPr>
+          <w:rStyle w:val="Hyperlink"/>
+          <w:sz w:val="22"/>
+          <w:szCs w:val="22"/>
+        </w:rPr>
+        <w:t>Mingoti</w:t>
+      </w:r>
+      <w:proofErr w:type="spellEnd"/>
+      <w:r>
+        <w:rPr>
+          <w:rStyle w:val="Hyperlink"/>
+          <w:sz w:val="22"/>
+          <w:szCs w:val="22"/>
+        </w:rPr>
+        <w:t xml:space="preserve"> and Lima, 2006</w:t>
+      </w:r>
+      <w:r>
+        <w:rPr>
+          <w:sz w:val="22"/>
+          <w:szCs w:val="22"/>
+        </w:rPr>
+        <w:fldChar w:fldCharType="end"/>
+      </w:r>
+      <w:bookmarkEnd w:id="12"/>
+      <w:r>
+        <w:rPr>
+          <w:sz w:val="22"/>
+          <w:szCs w:val="22"/>
+        </w:rPr>
+        <w:t>) and also adapting different clustering methods for a particular problem.</w:t>
+      </w:r>
+    </w:p>
+    <w:p>
+      <w:pPr>
+        <w:pStyle w:val="ListParagraph"/>
+        <w:tabs>
+          <w:tab w:val="left" w:pos="1842"/>
+        </w:tabs>
+        <w:rPr>
+          <w:sz w:val="22"/>
+          <w:szCs w:val="22"/>
+        </w:rPr>
+      </w:pPr>
+      <w:r>
+        <w:lastRenderedPageBreak/>
+        <w:fldChar w:fldCharType="begin"/>
+      </w:r>
+      <w:r>
+        <w:instrText xml:space="preserve"> INCLUDEPICTURE "https://ars.els-cdn.com/content/image/1-s2.0-S0957417410005300-gr1.jpg" \* MERGEFORMATINET </w:instrText>
+      </w:r>
+      <w:r>
+        <w:fldChar w:fldCharType="separate"/>
+      </w:r>
+      <w:r>
+        <w:rPr>
+          <w:noProof/>
+        </w:rPr>
+        <w:drawing>
+          <wp:inline distT="0" distB="0" distL="0" distR="0" wp14:anchorId="4BCAE2CC" wp14:editId="2D4D9F26">
+            <wp:extent cx="5732673" cy="3254400"/>
+            <wp:effectExtent l="0" t="0" r="0" b="0"/>
+            <wp:docPr id="1199148320" name="Picture 1" descr="A brief explanation of Markowitz model along with the clustering techniques &#10;"/>
+            <wp:cNvGraphicFramePr>
+              <a:graphicFrameLocks xmlns:a="http://schemas.openxmlformats.org/drawingml/2006/main" noChangeAspect="1"/>
+            </wp:cNvGraphicFramePr>
+            <a:graphic xmlns:a="http://schemas.openxmlformats.org/drawingml/2006/main">
+              <a:graphicData uri="http://schemas.openxmlformats.org/drawingml/2006/picture">
+                <pic:pic xmlns:pic="http://schemas.openxmlformats.org/drawingml/2006/picture">
+                  <pic:nvPicPr>
+                    <pic:cNvPr id="1199148320" name="Picture 1" descr="A brief explanation of Markowitz model along with the clustering techniques &#10;"/>
+                    <pic:cNvPicPr>
+                      <a:picLocks noChangeAspect="1" noChangeArrowheads="1"/>
+                    </pic:cNvPicPr>
+                  </pic:nvPicPr>
+                  <pic:blipFill>
+                    <a:blip r:embed="rId23">
+                      <a:extLst>
+                        <a:ext uri="{28A0092B-C50C-407E-A947-70E740481C1C}">
+                          <a14:useLocalDpi xmlns:a14="http://schemas.microsoft.com/office/drawing/2010/main" val="0"/>
+                        </a:ext>
+                      </a:extLst>
+                    </a:blip>
+                    <a:srcRect/>
+                    <a:stretch>
+                      <a:fillRect/>
+                    </a:stretch>
+                  </pic:blipFill>
+                  <pic:spPr bwMode="auto">
+                    <a:xfrm>
+                      <a:off x="0" y="0"/>
+                      <a:ext cx="5732673" cy="3254400"/>
+                    </a:xfrm>
+                    <a:prstGeom prst="rect">
+                      <a:avLst/>
+                    </a:prstGeom>
+                    <a:noFill/>
+                    <a:ln>
+                      <a:noFill/>
+                    </a:ln>
+                  </pic:spPr>
+                </pic:pic>
+              </a:graphicData>
+            </a:graphic>
+          </wp:inline>
+        </w:drawing>
+      </w:r>
+      <w:r>
+        <w:fldChar w:fldCharType="end"/>
+      </w:r>
+    </w:p>
+    <w:p>
+      <w:pPr>
         <w:tabs>
           <w:tab w:val="left" w:pos="1842"/>
         </w:tabs>
@@ -3075,6 +3749,779 @@
           <w:szCs w:val="22"/>
         </w:rPr>
       </w:pPr>
+      <w:r>
+        <w:rPr>
+          <w:sz w:val="22"/>
+          <w:szCs w:val="22"/>
+        </w:rPr>
+        <w:t>A brief explanation of Markowitz model along with the clustering techniques</w:t>
+      </w:r>
+    </w:p>
+    <w:p>
+      <w:pPr>
+        <w:pStyle w:val="ListParagraph"/>
+        <w:numPr>
+          <w:ilvl w:val="0"/>
+          <w:numId w:val="2"/>
+        </w:numPr>
+        <w:tabs>
+          <w:tab w:val="left" w:pos="1842"/>
+        </w:tabs>
+        <w:rPr>
+          <w:sz w:val="22"/>
+          <w:szCs w:val="22"/>
+        </w:rPr>
+      </w:pPr>
+      <w:r>
+        <w:rPr>
+          <w:i/>
+          <w:iCs/>
+          <w:sz w:val="22"/>
+          <w:szCs w:val="22"/>
+        </w:rPr>
+        <w:t>K</w:t>
+      </w:r>
+      <w:r>
+        <w:rPr>
+          <w:sz w:val="22"/>
+          <w:szCs w:val="22"/>
+        </w:rPr>
+        <w:t>-means clustering aims to partition </w:t>
+      </w:r>
+      <w:r>
+        <w:rPr>
+          <w:i/>
+          <w:iCs/>
+          <w:sz w:val="22"/>
+          <w:szCs w:val="22"/>
+        </w:rPr>
+        <w:t>n</w:t>
+      </w:r>
+      <w:r>
+        <w:rPr>
+          <w:sz w:val="22"/>
+          <w:szCs w:val="22"/>
+        </w:rPr>
+        <w:t> observations into </w:t>
+      </w:r>
+      <w:r>
+        <w:rPr>
+          <w:i/>
+          <w:iCs/>
+          <w:sz w:val="22"/>
+          <w:szCs w:val="22"/>
+        </w:rPr>
+        <w:t>k</w:t>
+      </w:r>
+      <w:r>
+        <w:rPr>
+          <w:sz w:val="22"/>
+          <w:szCs w:val="22"/>
+        </w:rPr>
+        <w:t> clusters in which each observation belongs to the cluster with the nearest mean. </w:t>
+      </w:r>
+      <w:r>
+        <w:rPr>
+          <w:i/>
+          <w:iCs/>
+          <w:sz w:val="22"/>
+          <w:szCs w:val="22"/>
+        </w:rPr>
+        <w:t>K</w:t>
+      </w:r>
+      <w:r>
+        <w:rPr>
+          <w:sz w:val="22"/>
+          <w:szCs w:val="22"/>
+        </w:rPr>
+        <w:t xml:space="preserve">-means starts with a single cluster with its </w:t>
+      </w:r>
+      <w:proofErr w:type="spellStart"/>
+      <w:r>
+        <w:rPr>
+          <w:sz w:val="22"/>
+          <w:szCs w:val="22"/>
+        </w:rPr>
+        <w:t>center</w:t>
+      </w:r>
+      <w:proofErr w:type="spellEnd"/>
+      <w:r>
+        <w:rPr>
+          <w:sz w:val="22"/>
+          <w:szCs w:val="22"/>
+        </w:rPr>
+        <w:t xml:space="preserve"> as the mean of the data. This cluster is split to two and the means of the new clusters are trained iteratively. These clusters again </w:t>
+      </w:r>
+      <w:proofErr w:type="gramStart"/>
+      <w:r>
+        <w:rPr>
+          <w:sz w:val="22"/>
+          <w:szCs w:val="22"/>
+        </w:rPr>
+        <w:t>split</w:t>
+      </w:r>
+      <w:proofErr w:type="gramEnd"/>
+      <w:r>
+        <w:rPr>
+          <w:sz w:val="22"/>
+          <w:szCs w:val="22"/>
+        </w:rPr>
+        <w:t xml:space="preserve"> and the process continues until the specified number of clusters is obtained. If the specified number of clusters is not a power of two, then the nearest power of two above the number specified is chosen. Then the least important clusters are </w:t>
+      </w:r>
+      <w:proofErr w:type="gramStart"/>
+      <w:r>
+        <w:rPr>
+          <w:sz w:val="22"/>
+          <w:szCs w:val="22"/>
+        </w:rPr>
+        <w:t>removed</w:t>
+      </w:r>
+      <w:proofErr w:type="gramEnd"/>
+      <w:r>
+        <w:rPr>
+          <w:sz w:val="22"/>
+          <w:szCs w:val="22"/>
+        </w:rPr>
+        <w:t xml:space="preserve"> and the remaining clusters are again iteratively trained to get the final clusters. This is a </w:t>
+      </w:r>
+      <w:proofErr w:type="spellStart"/>
+      <w:proofErr w:type="gramStart"/>
+      <w:r>
+        <w:rPr>
+          <w:sz w:val="22"/>
+          <w:szCs w:val="22"/>
+        </w:rPr>
+        <w:t>non hierarchical</w:t>
+      </w:r>
+      <w:proofErr w:type="spellEnd"/>
+      <w:proofErr w:type="gramEnd"/>
+      <w:r>
+        <w:rPr>
+          <w:sz w:val="22"/>
+          <w:szCs w:val="22"/>
+        </w:rPr>
+        <w:t xml:space="preserve"> method.</w:t>
+      </w:r>
+    </w:p>
+    <w:p>
+      <w:pPr>
+        <w:pStyle w:val="ListParagraph"/>
+        <w:numPr>
+          <w:ilvl w:val="0"/>
+          <w:numId w:val="2"/>
+        </w:numPr>
+        <w:tabs>
+          <w:tab w:val="left" w:pos="1842"/>
+        </w:tabs>
+        <w:rPr>
+          <w:sz w:val="22"/>
+          <w:szCs w:val="22"/>
+        </w:rPr>
+      </w:pPr>
+      <w:r>
+        <w:rPr>
+          <w:sz w:val="22"/>
+          <w:szCs w:val="22"/>
+        </w:rPr>
+        <w:t xml:space="preserve">In Fuzzy clustering methods data points can be assigned to more than one cluster with different degree of membership. In some </w:t>
+      </w:r>
+      <w:proofErr w:type="gramStart"/>
+      <w:r>
+        <w:rPr>
+          <w:sz w:val="22"/>
+          <w:szCs w:val="22"/>
+        </w:rPr>
+        <w:t>cases</w:t>
+      </w:r>
+      <w:proofErr w:type="gramEnd"/>
+      <w:r>
+        <w:rPr>
+          <w:sz w:val="22"/>
+          <w:szCs w:val="22"/>
+        </w:rPr>
+        <w:t xml:space="preserve"> it can perform well over hard clustering methods because of its ability to assign probability of a data point belonging to a particular cluster. It aims to minimize the Fuzzy version of classical “within groups’ sum of squared error objective function” according to the fuzziness exponent by using Picard iterations.</w:t>
+      </w:r>
+    </w:p>
+    <w:p>
+      <w:pPr>
+        <w:pStyle w:val="ListParagraph"/>
+        <w:numPr>
+          <w:ilvl w:val="0"/>
+          <w:numId w:val="2"/>
+        </w:numPr>
+        <w:spacing w:after="240" w:line="240" w:lineRule="auto"/>
+        <w:rPr>
+          <w:rFonts w:ascii="Georgia" w:eastAsia="Times New Roman" w:hAnsi="Georgia" w:cs="Times New Roman"/>
+          <w:color w:val="1F1F1F"/>
+          <w:kern w:val="0"/>
+          <w:sz w:val="22"/>
+          <w:szCs w:val="22"/>
+          <w:lang w:eastAsia="en-GB"/>
+          <w14:ligatures w14:val="none"/>
+        </w:rPr>
+      </w:pPr>
+      <w:r>
+        <w:rPr>
+          <w:rFonts w:ascii="Georgia" w:eastAsia="Times New Roman" w:hAnsi="Georgia" w:cs="Times New Roman"/>
+          <w:color w:val="1F1F1F"/>
+          <w:kern w:val="0"/>
+          <w:sz w:val="22"/>
+          <w:szCs w:val="22"/>
+          <w:lang w:eastAsia="en-GB"/>
+          <w14:ligatures w14:val="none"/>
+        </w:rPr>
+        <w:t xml:space="preserve">SOM imitates the function of ‘grouping by categories’ operated by human brain and every output processing element would affect each other. It includes a set of neurons usually arranged in a two-dimensional structure, in such a way that there exist neighbourhood relations among the neurons, which dictates the topology, or structure. The neurons are well connected to each other from input to output </w:t>
+      </w:r>
+      <w:proofErr w:type="gramStart"/>
+      <w:r>
+        <w:rPr>
+          <w:rFonts w:ascii="Georgia" w:eastAsia="Times New Roman" w:hAnsi="Georgia" w:cs="Times New Roman"/>
+          <w:color w:val="1F1F1F"/>
+          <w:kern w:val="0"/>
+          <w:sz w:val="22"/>
+          <w:szCs w:val="22"/>
+          <w:lang w:eastAsia="en-GB"/>
+          <w14:ligatures w14:val="none"/>
+        </w:rPr>
+        <w:t>layers</w:t>
+      </w:r>
+      <w:proofErr w:type="gramEnd"/>
+      <w:r>
+        <w:rPr>
+          <w:rFonts w:ascii="Georgia" w:eastAsia="Times New Roman" w:hAnsi="Georgia" w:cs="Times New Roman"/>
+          <w:color w:val="1F1F1F"/>
+          <w:kern w:val="0"/>
+          <w:sz w:val="22"/>
+          <w:szCs w:val="22"/>
+          <w:lang w:eastAsia="en-GB"/>
+          <w14:ligatures w14:val="none"/>
+        </w:rPr>
+        <w:t xml:space="preserve"> but they are not connected to themselves.</w:t>
+      </w:r>
+    </w:p>
+    <w:p>
+      <w:pPr>
+        <w:pStyle w:val="ListParagraph"/>
+        <w:numPr>
+          <w:ilvl w:val="0"/>
+          <w:numId w:val="2"/>
+        </w:numPr>
+        <w:spacing w:after="240" w:line="240" w:lineRule="auto"/>
+        <w:rPr>
+          <w:rFonts w:ascii="Georgia" w:eastAsia="Times New Roman" w:hAnsi="Georgia" w:cs="Times New Roman"/>
+          <w:color w:val="1F1F1F"/>
+          <w:kern w:val="0"/>
+          <w:sz w:val="22"/>
+          <w:szCs w:val="22"/>
+          <w:lang w:eastAsia="en-GB"/>
+          <w14:ligatures w14:val="none"/>
+        </w:rPr>
+      </w:pPr>
+      <w:r>
+        <w:rPr>
+          <w:rFonts w:ascii="Georgia" w:eastAsia="Times New Roman" w:hAnsi="Georgia" w:cs="Times New Roman"/>
+          <w:color w:val="1F1F1F"/>
+          <w:kern w:val="0"/>
+          <w:sz w:val="22"/>
+          <w:szCs w:val="22"/>
+          <w:lang w:eastAsia="en-GB"/>
+          <w14:ligatures w14:val="none"/>
+        </w:rPr>
+        <w:t xml:space="preserve">It uses unsupervised learning which is known as </w:t>
+      </w:r>
+      <w:proofErr w:type="spellStart"/>
+      <w:r>
+        <w:rPr>
+          <w:rFonts w:ascii="Georgia" w:eastAsia="Times New Roman" w:hAnsi="Georgia" w:cs="Times New Roman"/>
+          <w:color w:val="1F1F1F"/>
+          <w:kern w:val="0"/>
+          <w:sz w:val="22"/>
+          <w:szCs w:val="22"/>
+          <w:lang w:eastAsia="en-GB"/>
+          <w14:ligatures w14:val="none"/>
+        </w:rPr>
+        <w:t>self organization</w:t>
+      </w:r>
+      <w:proofErr w:type="spellEnd"/>
+      <w:r>
+        <w:rPr>
+          <w:rFonts w:ascii="Georgia" w:eastAsia="Times New Roman" w:hAnsi="Georgia" w:cs="Times New Roman"/>
+          <w:color w:val="1F1F1F"/>
+          <w:kern w:val="0"/>
+          <w:sz w:val="22"/>
+          <w:szCs w:val="22"/>
+          <w:lang w:eastAsia="en-GB"/>
+          <w14:ligatures w14:val="none"/>
+        </w:rPr>
+        <w:t xml:space="preserve"> to visualize topologies and hierarchical structures of high dimensional input spaces. The algorithm of SOM is initialized by assigning the values of weight vectors of each output neuron linearly or randomly. Training process of SOM starts by representing a data point randomly in the network. The distances between these data points and the weight vectors of all neurons are computed by using distance measures such as Euclidean distance. The nearest neuron wins and is thus updated to move closer to </w:t>
+      </w:r>
+      <w:r>
+        <w:rPr>
+          <w:rFonts w:ascii="Georgia" w:eastAsia="Times New Roman" w:hAnsi="Georgia" w:cs="Times New Roman"/>
+          <w:color w:val="1F1F1F"/>
+          <w:kern w:val="0"/>
+          <w:sz w:val="22"/>
+          <w:szCs w:val="22"/>
+          <w:lang w:eastAsia="en-GB"/>
+          <w14:ligatures w14:val="none"/>
+        </w:rPr>
+        <w:lastRenderedPageBreak/>
+        <w:t>the data point. SOM converges into a stable structure and represents information that is learned. SOM reflects an input value onto a point of plane, and the points around neighbouring area have similar functions.</w:t>
+      </w:r>
+    </w:p>
+    <w:p>
+      <w:pPr>
+        <w:pStyle w:val="ListParagraph"/>
+        <w:numPr>
+          <w:ilvl w:val="0"/>
+          <w:numId w:val="2"/>
+        </w:numPr>
+        <w:tabs>
+          <w:tab w:val="left" w:pos="1842"/>
+        </w:tabs>
+        <w:rPr>
+          <w:sz w:val="21"/>
+          <w:szCs w:val="21"/>
+        </w:rPr>
+      </w:pPr>
+      <w:r>
+        <w:rPr>
+          <w:sz w:val="21"/>
+          <w:szCs w:val="21"/>
+        </w:rPr>
+        <w:t xml:space="preserve">Validity measures: silhouette index, </w:t>
+      </w:r>
+      <w:proofErr w:type="spellStart"/>
+      <w:r>
+        <w:rPr>
+          <w:sz w:val="21"/>
+          <w:szCs w:val="21"/>
+        </w:rPr>
+        <w:t>davies-bouldin</w:t>
+      </w:r>
+      <w:proofErr w:type="spellEnd"/>
+      <w:r>
+        <w:rPr>
+          <w:sz w:val="21"/>
+          <w:szCs w:val="21"/>
+        </w:rPr>
+        <w:t xml:space="preserve"> index, </w:t>
+      </w:r>
+      <w:proofErr w:type="spellStart"/>
+      <w:r>
+        <w:rPr>
+          <w:sz w:val="21"/>
+          <w:szCs w:val="21"/>
+        </w:rPr>
+        <w:t>calinski-harabasz</w:t>
+      </w:r>
+      <w:proofErr w:type="spellEnd"/>
+      <w:r>
+        <w:rPr>
+          <w:sz w:val="21"/>
+          <w:szCs w:val="21"/>
+        </w:rPr>
+        <w:t xml:space="preserve"> index, </w:t>
+      </w:r>
+      <w:proofErr w:type="spellStart"/>
+      <w:r>
+        <w:rPr>
+          <w:sz w:val="21"/>
+          <w:szCs w:val="21"/>
+        </w:rPr>
+        <w:t>krzanowski-lai</w:t>
+      </w:r>
+      <w:proofErr w:type="spellEnd"/>
+      <w:r>
+        <w:rPr>
+          <w:sz w:val="21"/>
+          <w:szCs w:val="21"/>
+        </w:rPr>
+        <w:t xml:space="preserve"> index, </w:t>
+      </w:r>
+      <w:proofErr w:type="spellStart"/>
+      <w:r>
+        <w:rPr>
+          <w:sz w:val="21"/>
+          <w:szCs w:val="21"/>
+        </w:rPr>
+        <w:t>dunn’s</w:t>
+      </w:r>
+      <w:proofErr w:type="spellEnd"/>
+      <w:r>
+        <w:rPr>
+          <w:sz w:val="21"/>
+          <w:szCs w:val="21"/>
+        </w:rPr>
+        <w:t xml:space="preserve"> index, alternative </w:t>
+      </w:r>
+      <w:proofErr w:type="spellStart"/>
+      <w:r>
+        <w:rPr>
+          <w:sz w:val="21"/>
+          <w:szCs w:val="21"/>
+        </w:rPr>
+        <w:t>dunn</w:t>
+      </w:r>
+      <w:proofErr w:type="spellEnd"/>
+      <w:r>
+        <w:rPr>
+          <w:sz w:val="21"/>
+          <w:szCs w:val="21"/>
+        </w:rPr>
+        <w:t xml:space="preserve"> index.</w:t>
+      </w:r>
+    </w:p>
+    <w:p>
+      <w:pPr>
+        <w:pStyle w:val="ListParagraph"/>
+        <w:numPr>
+          <w:ilvl w:val="0"/>
+          <w:numId w:val="2"/>
+        </w:numPr>
+        <w:tabs>
+          <w:tab w:val="left" w:pos="1842"/>
+        </w:tabs>
+        <w:rPr>
+          <w:sz w:val="21"/>
+          <w:szCs w:val="21"/>
+        </w:rPr>
+      </w:pPr>
+      <w:r>
+        <w:rPr>
+          <w:sz w:val="21"/>
+          <w:szCs w:val="21"/>
+        </w:rPr>
+        <w:t xml:space="preserve">In case of overlapped </w:t>
+      </w:r>
+      <w:proofErr w:type="gramStart"/>
+      <w:r>
+        <w:rPr>
+          <w:sz w:val="21"/>
+          <w:szCs w:val="21"/>
+        </w:rPr>
+        <w:t>clusters</w:t>
+      </w:r>
+      <w:proofErr w:type="gramEnd"/>
+      <w:r>
+        <w:rPr>
+          <w:sz w:val="21"/>
+          <w:szCs w:val="21"/>
+        </w:rPr>
+        <w:t xml:space="preserve"> the above index values are not very reliable because of repartitioning the results with the hard partition method. So the indexes below are very relevant for Fuzzy clustering (</w:t>
+      </w:r>
+      <w:proofErr w:type="spellStart"/>
+      <w:r>
+        <w:rPr>
+          <w:sz w:val="21"/>
+          <w:szCs w:val="21"/>
+        </w:rPr>
+        <w:fldChar w:fldCharType="begin"/>
+      </w:r>
+      <w:r>
+        <w:rPr>
+          <w:sz w:val="21"/>
+          <w:szCs w:val="21"/>
+        </w:rPr>
+        <w:instrText>HYPERLINK "https://www.sciencedirect.com/science/article/pii/S0957417410005300" \l "bib4"</w:instrText>
+      </w:r>
+      <w:r>
+        <w:rPr>
+          <w:sz w:val="21"/>
+          <w:szCs w:val="21"/>
+        </w:rPr>
+      </w:r>
+      <w:r>
+        <w:rPr>
+          <w:sz w:val="21"/>
+          <w:szCs w:val="21"/>
+        </w:rPr>
+        <w:fldChar w:fldCharType="separate"/>
+      </w:r>
+      <w:r>
+        <w:rPr>
+          <w:rStyle w:val="Hyperlink"/>
+          <w:sz w:val="21"/>
+          <w:szCs w:val="21"/>
+        </w:rPr>
+        <w:t>Bezdek</w:t>
+      </w:r>
+      <w:proofErr w:type="spellEnd"/>
+      <w:r>
+        <w:rPr>
+          <w:rStyle w:val="Hyperlink"/>
+          <w:sz w:val="21"/>
+          <w:szCs w:val="21"/>
+        </w:rPr>
+        <w:t xml:space="preserve"> &amp; Pal, 2005</w:t>
+      </w:r>
+      <w:r>
+        <w:rPr>
+          <w:sz w:val="21"/>
+          <w:szCs w:val="21"/>
+        </w:rPr>
+        <w:fldChar w:fldCharType="end"/>
+      </w:r>
+      <w:r>
+        <w:rPr>
+          <w:sz w:val="21"/>
+          <w:szCs w:val="21"/>
+        </w:rPr>
+        <w:t>).</w:t>
+      </w:r>
+    </w:p>
+    <w:p>
+      <w:pPr>
+        <w:pStyle w:val="ListParagraph"/>
+        <w:numPr>
+          <w:ilvl w:val="0"/>
+          <w:numId w:val="2"/>
+        </w:numPr>
+        <w:tabs>
+          <w:tab w:val="left" w:pos="1842"/>
+        </w:tabs>
+        <w:rPr>
+          <w:sz w:val="21"/>
+          <w:szCs w:val="21"/>
+        </w:rPr>
+      </w:pPr>
+      <w:r>
+        <w:rPr>
+          <w:sz w:val="21"/>
+          <w:szCs w:val="21"/>
+        </w:rPr>
+        <w:t xml:space="preserve">Xie and Beni’s index, partition index, separation index. </w:t>
+      </w:r>
+    </w:p>
+    <w:p>
+      <w:pPr>
+        <w:pStyle w:val="ListParagraph"/>
+        <w:numPr>
+          <w:ilvl w:val="0"/>
+          <w:numId w:val="2"/>
+        </w:numPr>
+        <w:tabs>
+          <w:tab w:val="left" w:pos="1842"/>
+        </w:tabs>
+        <w:rPr>
+          <w:sz w:val="21"/>
+          <w:szCs w:val="21"/>
+        </w:rPr>
+      </w:pPr>
+      <w:proofErr w:type="spellStart"/>
+      <w:r>
+        <w:rPr>
+          <w:sz w:val="21"/>
+          <w:szCs w:val="21"/>
+        </w:rPr>
+        <w:t>Capitaline</w:t>
+      </w:r>
+      <w:proofErr w:type="spellEnd"/>
+      <w:r>
+        <w:rPr>
+          <w:sz w:val="21"/>
+          <w:szCs w:val="21"/>
+        </w:rPr>
+        <w:t xml:space="preserve"> Databases Plus (a financial information database)</w:t>
+      </w:r>
+    </w:p>
+    <w:p>
+      <w:pPr>
+        <w:pStyle w:val="ListParagraph"/>
+        <w:numPr>
+          <w:ilvl w:val="0"/>
+          <w:numId w:val="2"/>
+        </w:numPr>
+        <w:tabs>
+          <w:tab w:val="left" w:pos="1842"/>
+        </w:tabs>
+        <w:rPr>
+          <w:sz w:val="21"/>
+          <w:szCs w:val="21"/>
+        </w:rPr>
+      </w:pPr>
+      <w:r>
+        <w:rPr>
+          <w:sz w:val="21"/>
+          <w:szCs w:val="21"/>
+        </w:rPr>
+        <w:t>clustering toolbox of MATLAB</w:t>
+      </w:r>
+    </w:p>
+    <w:p>
+      <w:pPr>
+        <w:pStyle w:val="ListParagraph"/>
+        <w:numPr>
+          <w:ilvl w:val="0"/>
+          <w:numId w:val="2"/>
+        </w:numPr>
+        <w:tabs>
+          <w:tab w:val="left" w:pos="1842"/>
+        </w:tabs>
+        <w:rPr>
+          <w:sz w:val="21"/>
+          <w:szCs w:val="21"/>
+        </w:rPr>
+      </w:pPr>
+      <w:r>
+        <w:rPr>
+          <w:sz w:val="21"/>
+          <w:szCs w:val="21"/>
+        </w:rPr>
+        <w:t>Performance comparison of the clustering methods is done using Intraclass inertia (</w:t>
+      </w:r>
+      <w:bookmarkStart w:id="13" w:name="bbib19"/>
+      <w:r>
+        <w:rPr>
+          <w:sz w:val="21"/>
+          <w:szCs w:val="21"/>
+        </w:rPr>
+        <w:fldChar w:fldCharType="begin"/>
+      </w:r>
+      <w:r>
+        <w:rPr>
+          <w:sz w:val="21"/>
+          <w:szCs w:val="21"/>
+        </w:rPr>
+        <w:instrText>HYPERLINK "https://www.sciencedirect.com/science/article/pii/S0957417410005300" \l "bib19"</w:instrText>
+      </w:r>
+      <w:r>
+        <w:rPr>
+          <w:sz w:val="21"/>
+          <w:szCs w:val="21"/>
+        </w:rPr>
+      </w:r>
+      <w:r>
+        <w:rPr>
+          <w:sz w:val="21"/>
+          <w:szCs w:val="21"/>
+        </w:rPr>
+        <w:fldChar w:fldCharType="separate"/>
+      </w:r>
+      <w:r>
+        <w:rPr>
+          <w:rStyle w:val="Hyperlink"/>
+          <w:sz w:val="21"/>
+          <w:szCs w:val="21"/>
+        </w:rPr>
+        <w:t>Michaud, 1997</w:t>
+      </w:r>
+      <w:r>
+        <w:rPr>
+          <w:sz w:val="21"/>
+          <w:szCs w:val="21"/>
+        </w:rPr>
+        <w:fldChar w:fldCharType="end"/>
+      </w:r>
+      <w:bookmarkEnd w:id="13"/>
+      <w:r>
+        <w:rPr>
+          <w:sz w:val="21"/>
+          <w:szCs w:val="21"/>
+        </w:rPr>
+        <w:t>). </w:t>
+      </w:r>
+    </w:p>
+    <w:p>
+      <w:pPr>
+        <w:pStyle w:val="ListParagraph"/>
+        <w:numPr>
+          <w:ilvl w:val="0"/>
+          <w:numId w:val="2"/>
+        </w:numPr>
+        <w:tabs>
+          <w:tab w:val="left" w:pos="1842"/>
+        </w:tabs>
+        <w:rPr>
+          <w:sz w:val="21"/>
+          <w:szCs w:val="21"/>
+        </w:rPr>
+      </w:pPr>
+      <w:r>
+        <w:rPr>
+          <w:sz w:val="21"/>
+          <w:szCs w:val="21"/>
+        </w:rPr>
+        <w:t>Intraclass inertia </w:t>
+      </w:r>
+      <w:r>
+        <w:rPr>
+          <w:i/>
+          <w:iCs/>
+          <w:sz w:val="21"/>
+          <w:szCs w:val="21"/>
+        </w:rPr>
+        <w:t>F</w:t>
+      </w:r>
+      <w:r>
+        <w:rPr>
+          <w:sz w:val="21"/>
+          <w:szCs w:val="21"/>
+        </w:rPr>
+        <w:t>(</w:t>
+      </w:r>
+      <w:r>
+        <w:rPr>
+          <w:i/>
+          <w:iCs/>
+          <w:sz w:val="21"/>
+          <w:szCs w:val="21"/>
+        </w:rPr>
+        <w:t>K</w:t>
+      </w:r>
+      <w:r>
+        <w:rPr>
+          <w:sz w:val="21"/>
+          <w:szCs w:val="21"/>
+        </w:rPr>
+        <w:t>) is a measure of how compact each cluster (class) is when the number of clusters is fixed. It can also be defined as the average squared Euclidean distance between each observation and its cluster mean. </w:t>
+      </w:r>
+    </w:p>
+    <w:p>
+      <w:pPr>
+        <w:pStyle w:val="ListParagraph"/>
+        <w:numPr>
+          <w:ilvl w:val="0"/>
+          <w:numId w:val="2"/>
+        </w:numPr>
+        <w:tabs>
+          <w:tab w:val="left" w:pos="1842"/>
+        </w:tabs>
+        <w:rPr>
+          <w:sz w:val="21"/>
+          <w:szCs w:val="21"/>
+        </w:rPr>
+      </w:pPr>
+      <w:r>
+        <w:rPr>
+          <w:sz w:val="21"/>
+          <w:szCs w:val="21"/>
+        </w:rPr>
+        <w:t>It can reduce a lot of time in selection of stocks as stocks of similar categories can be easily grouped into a cluster and thus best performing stocks from those groups can be selected. </w:t>
+      </w:r>
+    </w:p>
+    <w:p>
+      <w:pPr>
+        <w:pStyle w:val="ListParagraph"/>
+        <w:numPr>
+          <w:ilvl w:val="0"/>
+          <w:numId w:val="2"/>
+        </w:numPr>
+        <w:tabs>
+          <w:tab w:val="left" w:pos="1842"/>
+        </w:tabs>
+        <w:rPr>
+          <w:sz w:val="21"/>
+          <w:szCs w:val="21"/>
+        </w:rPr>
+      </w:pPr>
+      <w:r>
+        <w:rPr>
+          <w:sz w:val="21"/>
+          <w:szCs w:val="21"/>
+        </w:rPr>
+        <w:t>Our work can find a lot of applications in software development for areas like asset management, algorithmic trading and Investor’s technical information in financial markets.</w:t>
+      </w:r>
     </w:p>
     <w:sectPr>
       <w:pgSz w:w="11906" w:h="16838"/>

</xml_diff>

<commit_message>
Did some more research for report
</commit_message>
<xml_diff>
--- a/research.docx
+++ b/research.docx
@@ -1705,7 +1705,7 @@
           <w:szCs w:val="22"/>
         </w:rPr>
         <w:drawing>
-          <wp:inline distT="0" distB="0" distL="0" distR="0" wp14:anchorId="2FF98D18" wp14:editId="279BA74B">
+          <wp:inline distT="0" distB="0" distL="0" distR="0" wp14:anchorId="2FF98D18" wp14:editId="632379B0">
             <wp:extent cx="4206240" cy="1426468"/>
             <wp:effectExtent l="0" t="0" r="0" b="0"/>
             <wp:docPr id="1164986002" name="Picture 5" descr="A math problem with numbers and equations&#10;&#10;Description automatically generated with medium confidence"/>
@@ -2583,7 +2583,7 @@
           <w:szCs w:val="22"/>
         </w:rPr>
         <w:drawing>
-          <wp:anchor distT="0" distB="0" distL="114300" distR="114300" simplePos="0" relativeHeight="251658240" behindDoc="0" locked="0" layoutInCell="1" allowOverlap="1" wp14:anchorId="51153E31" wp14:editId="1E546B0E">
+          <wp:anchor distT="0" distB="0" distL="114300" distR="114300" simplePos="0" relativeHeight="251658240" behindDoc="0" locked="0" layoutInCell="1" allowOverlap="1" wp14:anchorId="51153E31" wp14:editId="41CCA6B0">
             <wp:simplePos x="1143000" y="3174023"/>
             <wp:positionH relativeFrom="column">
               <wp:align>left</wp:align>
@@ -2726,7 +2726,7 @@
           <w:szCs w:val="22"/>
         </w:rPr>
         <w:drawing>
-          <wp:anchor distT="0" distB="0" distL="114300" distR="114300" simplePos="0" relativeHeight="251659264" behindDoc="0" locked="0" layoutInCell="1" allowOverlap="1" wp14:anchorId="21BBFE6D" wp14:editId="32D48739">
+          <wp:anchor distT="0" distB="0" distL="114300" distR="114300" simplePos="0" relativeHeight="251659264" behindDoc="0" locked="0" layoutInCell="1" allowOverlap="1" wp14:anchorId="21BBFE6D" wp14:editId="352E06EE">
             <wp:simplePos x="1143000" y="6093069"/>
             <wp:positionH relativeFrom="column">
               <wp:align>left</wp:align>
@@ -4821,6 +4821,518 @@
                 <w:szCs w:val="21"/>
               </w:rPr>
               <w:t>, pp.16-38.</w:t>
+            </w:r>
+          </w:p>
+          <w:p>
+            <w:pPr>
+              <w:pStyle w:val="ListParagraph"/>
+              <w:numPr>
+                <w:ilvl w:val="0"/>
+                <w:numId w:val="2"/>
+              </w:numPr>
+              <w:tabs>
+                <w:tab w:val="left" w:pos="1842"/>
+              </w:tabs>
+              <w:rPr>
+                <w:sz w:val="21"/>
+                <w:szCs w:val="21"/>
+              </w:rPr>
+            </w:pPr>
+            <w:r>
+              <w:rPr>
+                <w:sz w:val="21"/>
+                <w:szCs w:val="21"/>
+              </w:rPr>
+              <w:t>limited works are available for discrete valued time-series and also it is noticeable that most of </w:t>
+            </w:r>
+            <w:hyperlink r:id="rId24" w:history="1">
+              <w:r>
+                <w:rPr>
+                  <w:rStyle w:val="Hyperlink"/>
+                  <w:sz w:val="21"/>
+                  <w:szCs w:val="21"/>
+                </w:rPr>
+                <w:t>research works</w:t>
+              </w:r>
+            </w:hyperlink>
+            <w:r>
+              <w:rPr>
+                <w:sz w:val="21"/>
+                <w:szCs w:val="21"/>
+              </w:rPr>
+              <w:t xml:space="preserve"> are based on evenly sampled data while limited works addressed unevenly sampled data. </w:t>
+            </w:r>
+            <w:proofErr w:type="gramStart"/>
+            <w:r>
+              <w:rPr>
+                <w:sz w:val="21"/>
+                <w:szCs w:val="21"/>
+              </w:rPr>
+              <w:t>Additionally</w:t>
+            </w:r>
+            <w:proofErr w:type="gramEnd"/>
+            <w:r>
+              <w:rPr>
+                <w:sz w:val="21"/>
+                <w:szCs w:val="21"/>
+              </w:rPr>
+              <w:t xml:space="preserve"> data error is not taken into account in most of research works. Finally among all of the papers reviewed in this article, none of them addressed handling </w:t>
+            </w:r>
+            <w:hyperlink r:id="rId25" w:history="1">
+              <w:r>
+                <w:rPr>
+                  <w:rStyle w:val="Hyperlink"/>
+                  <w:sz w:val="21"/>
+                  <w:szCs w:val="21"/>
+                </w:rPr>
+                <w:t>multivariate time series</w:t>
+              </w:r>
+            </w:hyperlink>
+            <w:r>
+              <w:rPr>
+                <w:sz w:val="21"/>
+                <w:szCs w:val="21"/>
+              </w:rPr>
+              <w:t> data with different length for each variable.</w:t>
+            </w:r>
+          </w:p>
+          <w:p>
+            <w:pPr>
+              <w:pStyle w:val="ListParagraph"/>
+              <w:numPr>
+                <w:ilvl w:val="0"/>
+                <w:numId w:val="2"/>
+              </w:numPr>
+              <w:tabs>
+                <w:tab w:val="left" w:pos="1842"/>
+              </w:tabs>
+              <w:rPr>
+                <w:sz w:val="21"/>
+                <w:szCs w:val="21"/>
+              </w:rPr>
+            </w:pPr>
+            <w:r>
+              <w:rPr>
+                <w:sz w:val="21"/>
+                <w:szCs w:val="21"/>
+              </w:rPr>
+              <w:t>There is different distance measures designed for specifying similarity between time-series. The </w:t>
+            </w:r>
+            <w:proofErr w:type="spellStart"/>
+            <w:r>
+              <w:rPr>
+                <w:sz w:val="21"/>
+                <w:szCs w:val="21"/>
+              </w:rPr>
+              <w:fldChar w:fldCharType="begin"/>
+            </w:r>
+            <w:r>
+              <w:rPr>
+                <w:sz w:val="21"/>
+                <w:szCs w:val="21"/>
+              </w:rPr>
+              <w:instrText>HYPERLINK "https://www.sciencedirect.com/topics/computer-science/hausdorff-distance"</w:instrText>
+            </w:r>
+            <w:r>
+              <w:rPr>
+                <w:sz w:val="21"/>
+                <w:szCs w:val="21"/>
+              </w:rPr>
+            </w:r>
+            <w:r>
+              <w:rPr>
+                <w:sz w:val="21"/>
+                <w:szCs w:val="21"/>
+              </w:rPr>
+              <w:fldChar w:fldCharType="separate"/>
+            </w:r>
+            <w:r>
+              <w:rPr>
+                <w:rStyle w:val="Hyperlink"/>
+                <w:sz w:val="21"/>
+                <w:szCs w:val="21"/>
+              </w:rPr>
+              <w:t>Hausdorff</w:t>
+            </w:r>
+            <w:proofErr w:type="spellEnd"/>
+            <w:r>
+              <w:rPr>
+                <w:rStyle w:val="Hyperlink"/>
+                <w:sz w:val="21"/>
+                <w:szCs w:val="21"/>
+              </w:rPr>
+              <w:t xml:space="preserve"> distance</w:t>
+            </w:r>
+            <w:r>
+              <w:rPr>
+                <w:sz w:val="21"/>
+                <w:szCs w:val="21"/>
+              </w:rPr>
+              <w:fldChar w:fldCharType="end"/>
+            </w:r>
+            <w:r>
+              <w:rPr>
+                <w:sz w:val="21"/>
+                <w:szCs w:val="21"/>
+              </w:rPr>
+              <w:t xml:space="preserve">, modified </w:t>
+            </w:r>
+            <w:proofErr w:type="spellStart"/>
+            <w:r>
+              <w:rPr>
+                <w:sz w:val="21"/>
+                <w:szCs w:val="21"/>
+              </w:rPr>
+              <w:t>Hausdorff</w:t>
+            </w:r>
+            <w:proofErr w:type="spellEnd"/>
+            <w:r>
+              <w:rPr>
+                <w:sz w:val="21"/>
+                <w:szCs w:val="21"/>
+              </w:rPr>
+              <w:t xml:space="preserve"> (MODH), HMM-based distance, Dynamic Time Warping (DTW), </w:t>
+            </w:r>
+            <w:hyperlink r:id="rId26" w:history="1">
+              <w:r>
+                <w:rPr>
+                  <w:rStyle w:val="Hyperlink"/>
+                  <w:sz w:val="21"/>
+                  <w:szCs w:val="21"/>
+                </w:rPr>
+                <w:t>Euclidean distance</w:t>
+              </w:r>
+            </w:hyperlink>
+            <w:r>
+              <w:rPr>
+                <w:sz w:val="21"/>
+                <w:szCs w:val="21"/>
+              </w:rPr>
+              <w:t>, </w:t>
+            </w:r>
+            <w:hyperlink r:id="rId27" w:history="1">
+              <w:r>
+                <w:rPr>
+                  <w:rStyle w:val="Hyperlink"/>
+                  <w:sz w:val="21"/>
+                  <w:szCs w:val="21"/>
+                </w:rPr>
+                <w:t>Euclidean distance</w:t>
+              </w:r>
+            </w:hyperlink>
+            <w:r>
+              <w:rPr>
+                <w:sz w:val="21"/>
+                <w:szCs w:val="21"/>
+              </w:rPr>
+              <w:t xml:space="preserve"> in a PCA subspace, and Longest Common Sub-Sequence (LCSS) are the </w:t>
+            </w:r>
+            <w:r>
+              <w:rPr>
+                <w:sz w:val="21"/>
+                <w:szCs w:val="21"/>
+              </w:rPr>
+              <w:lastRenderedPageBreak/>
+              <w:t>most popular distance measurement methods that are used for time-series data. </w:t>
+            </w:r>
+          </w:p>
+          <w:p>
+            <w:pPr>
+              <w:pStyle w:val="ListParagraph"/>
+              <w:numPr>
+                <w:ilvl w:val="0"/>
+                <w:numId w:val="2"/>
+              </w:numPr>
+              <w:tabs>
+                <w:tab w:val="left" w:pos="1842"/>
+              </w:tabs>
+              <w:rPr>
+                <w:sz w:val="21"/>
+                <w:szCs w:val="21"/>
+              </w:rPr>
+            </w:pPr>
+            <w:r>
+              <w:rPr>
+                <w:sz w:val="21"/>
+                <w:szCs w:val="21"/>
+              </w:rPr>
+              <w:t>Additionally, in contrast to most algorithms, hierarchy clustering does not require the number of clusters as an initial parameter which is a well-known and outstanding feature of this algorithm. It is also a strength point in time-series clustering, because usually it is hard to define the number of clusters in </w:t>
+            </w:r>
+            <w:hyperlink r:id="rId28" w:history="1">
+              <w:r>
+                <w:rPr>
+                  <w:rStyle w:val="Hyperlink"/>
+                  <w:sz w:val="21"/>
+                  <w:szCs w:val="21"/>
+                </w:rPr>
+                <w:t>real world problems</w:t>
+              </w:r>
+            </w:hyperlink>
+            <w:r>
+              <w:rPr>
+                <w:sz w:val="21"/>
+                <w:szCs w:val="21"/>
+              </w:rPr>
+              <w:t>.</w:t>
+            </w:r>
+          </w:p>
+          <w:p>
+            <w:pPr>
+              <w:pStyle w:val="ListParagraph"/>
+              <w:numPr>
+                <w:ilvl w:val="0"/>
+                <w:numId w:val="2"/>
+              </w:numPr>
+              <w:tabs>
+                <w:tab w:val="left" w:pos="1842"/>
+              </w:tabs>
+              <w:rPr>
+                <w:sz w:val="21"/>
+                <w:szCs w:val="21"/>
+              </w:rPr>
+            </w:pPr>
+            <w:r>
+              <w:rPr>
+                <w:sz w:val="21"/>
+                <w:szCs w:val="21"/>
+              </w:rPr>
+              <w:t xml:space="preserve">In general, </w:t>
+            </w:r>
+            <w:proofErr w:type="gramStart"/>
+            <w:r>
+              <w:rPr>
+                <w:sz w:val="21"/>
+                <w:szCs w:val="21"/>
+              </w:rPr>
+              <w:t>model based</w:t>
+            </w:r>
+            <w:proofErr w:type="gramEnd"/>
+            <w:r>
+              <w:rPr>
+                <w:sz w:val="21"/>
+                <w:szCs w:val="21"/>
+              </w:rPr>
+              <w:t xml:space="preserve"> clustering has two drawbacks: first, it needs to set parameters and it is based on user assumptions which may be false and consequently the result clusters would be inaccurate. Second, it has a slow processing time (especially neural networks) on large datasets </w:t>
+            </w:r>
+            <w:bookmarkStart w:id="14" w:name="bbib186"/>
+            <w:r>
+              <w:rPr>
+                <w:sz w:val="21"/>
+                <w:szCs w:val="21"/>
+              </w:rPr>
+              <w:fldChar w:fldCharType="begin"/>
+            </w:r>
+            <w:r>
+              <w:rPr>
+                <w:sz w:val="21"/>
+                <w:szCs w:val="21"/>
+              </w:rPr>
+              <w:instrText>HYPERLINK "https://www.sciencedirect.com/science/article/pii/S0306437915000733" \l "bib186"</w:instrText>
+            </w:r>
+            <w:r>
+              <w:rPr>
+                <w:sz w:val="21"/>
+                <w:szCs w:val="21"/>
+              </w:rPr>
+            </w:r>
+            <w:r>
+              <w:rPr>
+                <w:sz w:val="21"/>
+                <w:szCs w:val="21"/>
+              </w:rPr>
+              <w:fldChar w:fldCharType="separate"/>
+            </w:r>
+            <w:r>
+              <w:rPr>
+                <w:rStyle w:val="Hyperlink"/>
+                <w:sz w:val="21"/>
+                <w:szCs w:val="21"/>
+              </w:rPr>
+              <w:t>[186]</w:t>
+            </w:r>
+            <w:r>
+              <w:rPr>
+                <w:sz w:val="21"/>
+                <w:szCs w:val="21"/>
+              </w:rPr>
+              <w:fldChar w:fldCharType="end"/>
+            </w:r>
+            <w:bookmarkEnd w:id="14"/>
+            <w:r>
+              <w:rPr>
+                <w:sz w:val="21"/>
+                <w:szCs w:val="21"/>
+              </w:rPr>
+              <w:t>.</w:t>
+            </w:r>
+          </w:p>
+          <w:p>
+            <w:pPr>
+              <w:pStyle w:val="ListParagraph"/>
+              <w:numPr>
+                <w:ilvl w:val="0"/>
+                <w:numId w:val="2"/>
+              </w:numPr>
+              <w:tabs>
+                <w:tab w:val="left" w:pos="1842"/>
+              </w:tabs>
+              <w:rPr>
+                <w:sz w:val="21"/>
+                <w:szCs w:val="21"/>
+              </w:rPr>
+            </w:pPr>
+            <w:r>
+              <w:rPr>
+                <w:sz w:val="21"/>
+                <w:szCs w:val="21"/>
+              </w:rPr>
+              <w:t>it is noticeable that density-based clustering has not been used broadly for time-series data clustering because of its rather high complexity.</w:t>
+            </w:r>
+          </w:p>
+          <w:p>
+            <w:pPr>
+              <w:pStyle w:val="ListParagraph"/>
+              <w:numPr>
+                <w:ilvl w:val="0"/>
+                <w:numId w:val="2"/>
+              </w:numPr>
+              <w:tabs>
+                <w:tab w:val="left" w:pos="1842"/>
+              </w:tabs>
+              <w:rPr>
+                <w:sz w:val="21"/>
+                <w:szCs w:val="21"/>
+              </w:rPr>
+            </w:pPr>
+            <w:r>
+              <w:rPr>
+                <w:sz w:val="21"/>
+                <w:szCs w:val="21"/>
+              </w:rPr>
+              <w:t>hierarchical clustering is restricted to the small datasets because of its quadratic </w:t>
+            </w:r>
+            <w:hyperlink r:id="rId29" w:history="1">
+              <w:r>
+                <w:rPr>
+                  <w:rStyle w:val="Hyperlink"/>
+                  <w:sz w:val="21"/>
+                  <w:szCs w:val="21"/>
+                </w:rPr>
+                <w:t>computational complexity</w:t>
+              </w:r>
+            </w:hyperlink>
+            <w:r>
+              <w:rPr>
+                <w:sz w:val="21"/>
+                <w:szCs w:val="21"/>
+              </w:rPr>
+              <w:t xml:space="preserve">. Model based and </w:t>
+            </w:r>
+            <w:proofErr w:type="gramStart"/>
+            <w:r>
+              <w:rPr>
+                <w:sz w:val="21"/>
+                <w:szCs w:val="21"/>
+              </w:rPr>
+              <w:t>density based</w:t>
+            </w:r>
+            <w:proofErr w:type="gramEnd"/>
+            <w:r>
+              <w:rPr>
+                <w:sz w:val="21"/>
+                <w:szCs w:val="21"/>
+              </w:rPr>
+              <w:t xml:space="preserve"> algorithms usage is scarce for the same problem of slow process and high complexity. In </w:t>
+            </w:r>
+            <w:proofErr w:type="gramStart"/>
+            <w:r>
+              <w:rPr>
+                <w:sz w:val="21"/>
+                <w:szCs w:val="21"/>
+              </w:rPr>
+              <w:t>addition</w:t>
+            </w:r>
+            <w:proofErr w:type="gramEnd"/>
+            <w:r>
+              <w:rPr>
+                <w:sz w:val="21"/>
+                <w:szCs w:val="21"/>
+              </w:rPr>
+              <w:t xml:space="preserve"> model based algorithms are suffering from their dependence on user assumptions for parameters.</w:t>
+            </w:r>
+          </w:p>
+          <w:p>
+            <w:pPr>
+              <w:pStyle w:val="ListParagraph"/>
+              <w:numPr>
+                <w:ilvl w:val="0"/>
+                <w:numId w:val="2"/>
+              </w:numPr>
+              <w:tabs>
+                <w:tab w:val="left" w:pos="1842"/>
+              </w:tabs>
+              <w:rPr>
+                <w:sz w:val="21"/>
+                <w:szCs w:val="21"/>
+              </w:rPr>
+            </w:pPr>
+            <w:r>
+              <w:rPr>
+                <w:sz w:val="21"/>
+                <w:szCs w:val="21"/>
+              </w:rPr>
+              <w:t>Further research works on time-series representation can address unattended or barely attended areas such as multivariate time series data with different length, unevenly sampled data and discrete valued time-series. In terms of similarity measures, many of proposed similarity measures do not show any improvements to Euclidean distance and as experiments in </w:t>
+            </w:r>
+            <w:bookmarkStart w:id="15" w:name="bbib6"/>
+            <w:r>
+              <w:rPr>
+                <w:sz w:val="21"/>
+                <w:szCs w:val="21"/>
+              </w:rPr>
+              <w:fldChar w:fldCharType="begin"/>
+            </w:r>
+            <w:r>
+              <w:rPr>
+                <w:sz w:val="21"/>
+                <w:szCs w:val="21"/>
+              </w:rPr>
+              <w:instrText>HYPERLINK "https://www.sciencedirect.com/science/article/pii/S0306437915000733" \l "bib6"</w:instrText>
+            </w:r>
+            <w:r>
+              <w:rPr>
+                <w:sz w:val="21"/>
+                <w:szCs w:val="21"/>
+              </w:rPr>
+            </w:r>
+            <w:r>
+              <w:rPr>
+                <w:sz w:val="21"/>
+                <w:szCs w:val="21"/>
+              </w:rPr>
+              <w:fldChar w:fldCharType="separate"/>
+            </w:r>
+            <w:r>
+              <w:rPr>
+                <w:rStyle w:val="Hyperlink"/>
+                <w:sz w:val="21"/>
+                <w:szCs w:val="21"/>
+              </w:rPr>
+              <w:t>[6]</w:t>
+            </w:r>
+            <w:r>
+              <w:rPr>
+                <w:sz w:val="21"/>
+                <w:szCs w:val="21"/>
+              </w:rPr>
+              <w:fldChar w:fldCharType="end"/>
+            </w:r>
+            <w:bookmarkEnd w:id="15"/>
+            <w:r>
+              <w:rPr>
+                <w:sz w:val="21"/>
+                <w:szCs w:val="21"/>
+              </w:rPr>
+              <w:t> shows their error rates are even worse.</w:t>
             </w:r>
           </w:p>
           <w:p>
@@ -5020,10 +5532,9 @@
                 <w:sz w:val="21"/>
                 <w:szCs w:val="21"/>
               </w:rPr>
-              <w:lastRenderedPageBreak/>
               <w:t>Cross-correlation might be a slow operation in time-series space, but it corresponds to point-wise multiplication in frequency space [</w:t>
             </w:r>
-            <w:hyperlink r:id="rId24" w:anchor="B55-electronics-10-03001" w:history="1">
+            <w:hyperlink r:id="rId30" w:anchor="B55-electronics-10-03001" w:history="1">
               <w:r>
                 <w:rPr>
                   <w:rStyle w:val="Hyperlink"/>
@@ -5042,7 +5553,7 @@
               </w:rPr>
               <w:t>]. It is also considered the best distance measure to detect a known waveform in random noise [</w:t>
             </w:r>
-            <w:hyperlink r:id="rId25" w:anchor="B55-electronics-10-03001" w:history="1">
+            <w:hyperlink r:id="rId31" w:anchor="B55-electronics-10-03001" w:history="1">
               <w:r>
                 <w:rPr>
                   <w:rStyle w:val="Hyperlink"/>
@@ -5098,9 +5609,17 @@
                 <w:sz w:val="21"/>
                 <w:szCs w:val="21"/>
               </w:rPr>
-              <w:t xml:space="preserve"> certain properties such as parameter selection and data analysis. However, one of its main disadvantages is that it does not work perfectly with time-series of unequal length, as it is difficult to define the dimension of weight vectors [</w:t>
+              <w:t xml:space="preserve"> certain properties such as parameter </w:t>
             </w:r>
-            <w:hyperlink r:id="rId26" w:anchor="B72-electronics-10-03001" w:history="1">
+            <w:r>
+              <w:rPr>
+                <w:sz w:val="21"/>
+                <w:szCs w:val="21"/>
+              </w:rPr>
+              <w:lastRenderedPageBreak/>
+              <w:t>selection and data analysis. However, one of its main disadvantages is that it does not work perfectly with time-series of unequal length, as it is difficult to define the dimension of weight vectors [</w:t>
+            </w:r>
+            <w:hyperlink r:id="rId32" w:anchor="B72-electronics-10-03001" w:history="1">
               <w:r>
                 <w:rPr>
                   <w:rStyle w:val="Hyperlink"/>
@@ -5142,7 +5661,7 @@
               </w:rPr>
               <w:t>Deep clustering [</w:t>
             </w:r>
-            <w:hyperlink r:id="rId27" w:anchor="B2-electronics-10-03001" w:history="1">
+            <w:hyperlink r:id="rId33" w:anchor="B2-electronics-10-03001" w:history="1">
               <w:r>
                 <w:rPr>
                   <w:rStyle w:val="Hyperlink"/>
@@ -5215,7 +5734,7 @@
                     <pic:cNvPicPr/>
                   </pic:nvPicPr>
                   <pic:blipFill>
-                    <a:blip r:embed="rId28">
+                    <a:blip r:embed="rId34">
                       <a:extLst>
                         <a:ext uri="{28A0092B-C50C-407E-A947-70E740481C1C}">
                           <a14:useLocalDpi xmlns:a14="http://schemas.microsoft.com/office/drawing/2010/main" val="0"/>
@@ -5301,7 +5820,7 @@
         </w:rPr>
         <w:t>Most of the previously described methods rely on the capabilities of the encoder, so the focus is on the auto-encoder architectures. Deep clustering with generative adversarial networks (GANs) [</w:t>
       </w:r>
-      <w:hyperlink r:id="rId29" w:anchor="B211-electronics-10-03001" w:history="1">
+      <w:hyperlink r:id="rId35" w:anchor="B211-electronics-10-03001" w:history="1">
         <w:r>
           <w:rPr>
             <w:rStyle w:val="Hyperlink"/>
@@ -5432,7 +5951,7 @@
         </w:rPr>
         <w:t>In [</w:t>
       </w:r>
-      <w:hyperlink r:id="rId30" w:anchor="B188-electronics-10-03001" w:history="1">
+      <w:hyperlink r:id="rId36" w:anchor="B188-electronics-10-03001" w:history="1">
         <w:r>
           <w:rPr>
             <w:rStyle w:val="Hyperlink"/>
@@ -5451,7 +5970,7 @@
         </w:rPr>
         <w:t>], soft-dynamic time warping (SDTW) [</w:t>
       </w:r>
-      <w:hyperlink r:id="rId31" w:anchor="B215-electronics-10-03001" w:history="1">
+      <w:hyperlink r:id="rId37" w:anchor="B215-electronics-10-03001" w:history="1">
         <w:r>
           <w:rPr>
             <w:rStyle w:val="Hyperlink"/>
@@ -5470,7 +5989,7 @@
         </w:rPr>
         <w:t>] was used as an alternative similarity measure to k-means, allowing for the management of dissimilarity evaluation of two time-series of variable length. The SDTW is a smooth formulation of DTW recently introduced to overcome the computational costs of DTW [</w:t>
       </w:r>
-      <w:hyperlink r:id="rId32" w:anchor="B216-electronics-10-03001" w:history="1">
+      <w:hyperlink r:id="rId38" w:anchor="B216-electronics-10-03001" w:history="1">
         <w:r>
           <w:rPr>
             <w:rStyle w:val="Hyperlink"/>
@@ -5605,7 +6124,6 @@
           <w:sz w:val="21"/>
           <w:szCs w:val="21"/>
         </w:rPr>
-        <w:lastRenderedPageBreak/>
         <w:drawing>
           <wp:inline distT="0" distB="0" distL="0" distR="0" wp14:anchorId="5BB7BFA5" wp14:editId="341D5E9A">
             <wp:extent cx="4114343" cy="1166474"/>
@@ -5622,7 +6140,7 @@
                     <pic:cNvPicPr/>
                   </pic:nvPicPr>
                   <pic:blipFill>
-                    <a:blip r:embed="rId33" cstate="print">
+                    <a:blip r:embed="rId39" cstate="print">
                       <a:extLst>
                         <a:ext uri="{28A0092B-C50C-407E-A947-70E740481C1C}">
                           <a14:useLocalDpi xmlns:a14="http://schemas.microsoft.com/office/drawing/2010/main" val="0"/>
@@ -5667,8 +6185,9 @@
           <w:sz w:val="21"/>
           <w:szCs w:val="21"/>
         </w:rPr>
+        <w:lastRenderedPageBreak/>
         <w:drawing>
-          <wp:inline distT="0" distB="0" distL="0" distR="0" wp14:anchorId="597BEBAA" wp14:editId="4E0BC1F9">
+          <wp:inline distT="0" distB="0" distL="0" distR="0" wp14:anchorId="597BEBAA" wp14:editId="6A5AB711">
             <wp:extent cx="4114165" cy="2041129"/>
             <wp:effectExtent l="0" t="0" r="635" b="3810"/>
             <wp:docPr id="339926041" name="Picture 3" descr="A text on a white background&#10;&#10;Description automatically generated"/>
@@ -5683,7 +6202,7 @@
                     <pic:cNvPicPr/>
                   </pic:nvPicPr>
                   <pic:blipFill>
-                    <a:blip r:embed="rId34" cstate="print">
+                    <a:blip r:embed="rId40" cstate="print">
                       <a:extLst>
                         <a:ext uri="{28A0092B-C50C-407E-A947-70E740481C1C}">
                           <a14:useLocalDpi xmlns:a14="http://schemas.microsoft.com/office/drawing/2010/main" val="0"/>
@@ -6526,15 +7045,7 @@
           <w:sz w:val="21"/>
           <w:szCs w:val="21"/>
         </w:rPr>
-        <w:t xml:space="preserve"> and </w:t>
-      </w:r>
-      <w:r>
-        <w:rPr>
-          <w:sz w:val="21"/>
-          <w:szCs w:val="21"/>
-        </w:rPr>
-        <w:lastRenderedPageBreak/>
-        <w:t>we show: (</w:t>
+        <w:t xml:space="preserve"> and we show: (</w:t>
       </w:r>
       <w:proofErr w:type="spellStart"/>
       <w:r>
@@ -6765,7 +7276,15 @@
           <w:sz w:val="21"/>
           <w:szCs w:val="21"/>
         </w:rPr>
-        <w:t xml:space="preserve"> is characterized with the notions of homogeneity —the similarity of observations within a cluster — and </w:t>
+        <w:t xml:space="preserve"> is characterized with the notions of homogeneity —the similarity </w:t>
+      </w:r>
+      <w:r>
+        <w:rPr>
+          <w:sz w:val="21"/>
+          <w:szCs w:val="21"/>
+        </w:rPr>
+        <w:lastRenderedPageBreak/>
+        <w:t xml:space="preserve">of observations within a cluster — and </w:t>
       </w:r>
       <w:proofErr w:type="spellStart"/>
       <w:r>
@@ -7401,7 +7920,7 @@
           <w:szCs w:val="21"/>
         </w:rPr>
         <w:drawing>
-          <wp:inline distT="0" distB="0" distL="0" distR="0" wp14:anchorId="114DB7C5" wp14:editId="22212886">
+          <wp:inline distT="0" distB="0" distL="0" distR="0" wp14:anchorId="114DB7C5" wp14:editId="553B989E">
             <wp:extent cx="3158837" cy="1683230"/>
             <wp:effectExtent l="0" t="0" r="3810" b="6350"/>
             <wp:docPr id="4570118" name="Picture 4" descr="A math equations and formulas&#10;&#10;Description automatically generated with medium confidence"/>
@@ -7416,7 +7935,7 @@
                     <pic:cNvPicPr/>
                   </pic:nvPicPr>
                   <pic:blipFill>
-                    <a:blip r:embed="rId35" cstate="print">
+                    <a:blip r:embed="rId41" cstate="print">
                       <a:extLst>
                         <a:ext uri="{28A0092B-C50C-407E-A947-70E740481C1C}">
                           <a14:useLocalDpi xmlns:a14="http://schemas.microsoft.com/office/drawing/2010/main" val="0"/>
@@ -7544,262 +8063,269 @@
           <w:sz w:val="21"/>
           <w:szCs w:val="21"/>
         </w:rPr>
+        <w:t xml:space="preserve">k-Shape Clustering Algorithm: k-Shape is a </w:t>
+      </w:r>
+      <w:proofErr w:type="spellStart"/>
+      <w:r>
+        <w:rPr>
+          <w:sz w:val="21"/>
+          <w:szCs w:val="21"/>
+        </w:rPr>
+        <w:t>partitionalclustering</w:t>
+      </w:r>
+      <w:proofErr w:type="spellEnd"/>
+      <w:r>
+        <w:rPr>
+          <w:sz w:val="21"/>
+          <w:szCs w:val="21"/>
+        </w:rPr>
+        <w:t xml:space="preserve"> method that is based on an iterative </w:t>
+      </w:r>
+      <w:proofErr w:type="spellStart"/>
+      <w:r>
+        <w:rPr>
+          <w:sz w:val="21"/>
+          <w:szCs w:val="21"/>
+        </w:rPr>
+        <w:t>reﬁnementprocedure</w:t>
+      </w:r>
+      <w:proofErr w:type="spellEnd"/>
+      <w:r>
+        <w:rPr>
+          <w:sz w:val="21"/>
+          <w:szCs w:val="21"/>
+        </w:rPr>
+        <w:t xml:space="preserve"> </w:t>
+      </w:r>
+      <w:proofErr w:type="gramStart"/>
+      <w:r>
+        <w:rPr>
+          <w:sz w:val="21"/>
+          <w:szCs w:val="21"/>
+        </w:rPr>
+        <w:t>similar to</w:t>
+      </w:r>
+      <w:proofErr w:type="gramEnd"/>
+      <w:r>
+        <w:rPr>
+          <w:sz w:val="21"/>
+          <w:szCs w:val="21"/>
+        </w:rPr>
+        <w:t xml:space="preserve"> the one used in k-means. Through </w:t>
+      </w:r>
+      <w:proofErr w:type="spellStart"/>
+      <w:r>
+        <w:rPr>
+          <w:sz w:val="21"/>
+          <w:szCs w:val="21"/>
+        </w:rPr>
+        <w:t>thisiterative</w:t>
+      </w:r>
+      <w:proofErr w:type="spellEnd"/>
+      <w:r>
+        <w:rPr>
+          <w:sz w:val="21"/>
+          <w:szCs w:val="21"/>
+        </w:rPr>
+        <w:t xml:space="preserve"> procedure, k-Shape minimizes the sum of </w:t>
+      </w:r>
+      <w:proofErr w:type="spellStart"/>
+      <w:r>
+        <w:rPr>
+          <w:sz w:val="21"/>
+          <w:szCs w:val="21"/>
+        </w:rPr>
+        <w:t>squareddistances</w:t>
+      </w:r>
+      <w:proofErr w:type="spellEnd"/>
+      <w:r>
+        <w:rPr>
+          <w:sz w:val="21"/>
+          <w:szCs w:val="21"/>
+        </w:rPr>
+        <w:t xml:space="preserve"> (Equation 1) and manages to: (</w:t>
+      </w:r>
+      <w:proofErr w:type="spellStart"/>
+      <w:r>
+        <w:rPr>
+          <w:sz w:val="21"/>
+          <w:szCs w:val="21"/>
+        </w:rPr>
+        <w:t>i</w:t>
+      </w:r>
+      <w:proofErr w:type="spellEnd"/>
+      <w:r>
+        <w:rPr>
+          <w:sz w:val="21"/>
+          <w:szCs w:val="21"/>
+        </w:rPr>
+        <w:t>) produce homo-</w:t>
+      </w:r>
+      <w:proofErr w:type="spellStart"/>
+      <w:r>
+        <w:rPr>
+          <w:sz w:val="21"/>
+          <w:szCs w:val="21"/>
+        </w:rPr>
+        <w:t>geneous</w:t>
+      </w:r>
+      <w:proofErr w:type="spellEnd"/>
+      <w:r>
+        <w:rPr>
+          <w:sz w:val="21"/>
+          <w:szCs w:val="21"/>
+        </w:rPr>
+        <w:t xml:space="preserve"> and well-separated clusters, and (ii) scale </w:t>
+      </w:r>
+      <w:proofErr w:type="spellStart"/>
+      <w:r>
+        <w:rPr>
+          <w:sz w:val="21"/>
+          <w:szCs w:val="21"/>
+        </w:rPr>
+        <w:t>linearlywith</w:t>
+      </w:r>
+      <w:proofErr w:type="spellEnd"/>
+      <w:r>
+        <w:rPr>
+          <w:sz w:val="21"/>
+          <w:szCs w:val="21"/>
+        </w:rPr>
+        <w:t xml:space="preserve"> the number of time series. Our algorithm compares se-</w:t>
+      </w:r>
+      <w:proofErr w:type="spellStart"/>
+      <w:r>
+        <w:rPr>
+          <w:sz w:val="21"/>
+          <w:szCs w:val="21"/>
+        </w:rPr>
+        <w:t>quences</w:t>
+      </w:r>
+      <w:proofErr w:type="spellEnd"/>
+      <w:r>
+        <w:rPr>
+          <w:sz w:val="21"/>
+          <w:szCs w:val="21"/>
+        </w:rPr>
+        <w:t xml:space="preserve"> e</w:t>
+      </w:r>
+      <w:r>
+        <w:rPr>
+          <w:rFonts w:ascii="Cambria Math" w:hAnsi="Cambria Math" w:cs="Cambria Math"/>
+          <w:sz w:val="21"/>
+          <w:szCs w:val="21"/>
+        </w:rPr>
+        <w:t>ﬃ</w:t>
+      </w:r>
+      <w:r>
+        <w:rPr>
+          <w:sz w:val="21"/>
+          <w:szCs w:val="21"/>
+        </w:rPr>
+        <w:t>ciently and computes centroids e</w:t>
+      </w:r>
+      <w:r>
+        <w:rPr>
+          <w:rFonts w:ascii="Cambria Math" w:hAnsi="Cambria Math" w:cs="Cambria Math"/>
+          <w:sz w:val="21"/>
+          <w:szCs w:val="21"/>
+        </w:rPr>
+        <w:t>ﬀ</w:t>
+      </w:r>
+      <w:r>
+        <w:rPr>
+          <w:sz w:val="21"/>
+          <w:szCs w:val="21"/>
+        </w:rPr>
+        <w:t xml:space="preserve">ectively </w:t>
+      </w:r>
+      <w:proofErr w:type="spellStart"/>
+      <w:r>
+        <w:rPr>
+          <w:sz w:val="21"/>
+          <w:szCs w:val="21"/>
+        </w:rPr>
+        <w:t>underthe</w:t>
+      </w:r>
+      <w:proofErr w:type="spellEnd"/>
+      <w:r>
+        <w:rPr>
+          <w:sz w:val="21"/>
+          <w:szCs w:val="21"/>
+        </w:rPr>
+        <w:t xml:space="preserve"> scaling-, translation-, and shift invariances. k-Shape is </w:t>
+      </w:r>
+      <w:proofErr w:type="spellStart"/>
+      <w:r>
+        <w:rPr>
+          <w:sz w:val="21"/>
+          <w:szCs w:val="21"/>
+        </w:rPr>
+        <w:t>anon</w:t>
+      </w:r>
+      <w:proofErr w:type="spellEnd"/>
+      <w:r>
+        <w:rPr>
+          <w:sz w:val="21"/>
+          <w:szCs w:val="21"/>
+        </w:rPr>
+        <w:t>-trivial instantiation of k-means and, in contrast to sim-</w:t>
+      </w:r>
+      <w:proofErr w:type="spellStart"/>
+      <w:r>
+        <w:rPr>
+          <w:sz w:val="21"/>
+          <w:szCs w:val="21"/>
+        </w:rPr>
+        <w:t>ilar</w:t>
+      </w:r>
+      <w:proofErr w:type="spellEnd"/>
+      <w:r>
+        <w:rPr>
+          <w:sz w:val="21"/>
+          <w:szCs w:val="21"/>
+        </w:rPr>
+        <w:t xml:space="preserve"> attempts in the literature [64, 87], its distance </w:t>
+      </w:r>
+      <w:proofErr w:type="spellStart"/>
+      <w:r>
+        <w:rPr>
+          <w:sz w:val="21"/>
+          <w:szCs w:val="21"/>
+        </w:rPr>
+        <w:t>measureand</w:t>
+      </w:r>
+      <w:proofErr w:type="spellEnd"/>
+      <w:r>
+        <w:rPr>
+          <w:sz w:val="21"/>
+          <w:szCs w:val="21"/>
+        </w:rPr>
+        <w:t xml:space="preserve"> centroid computation method make k-Shape the </w:t>
+      </w:r>
+      <w:proofErr w:type="spellStart"/>
+      <w:r>
+        <w:rPr>
+          <w:sz w:val="21"/>
+          <w:szCs w:val="21"/>
+        </w:rPr>
+        <w:t>onlyscalable</w:t>
+      </w:r>
+      <w:proofErr w:type="spellEnd"/>
+      <w:r>
+        <w:rPr>
+          <w:sz w:val="21"/>
+          <w:szCs w:val="21"/>
+        </w:rPr>
+        <w:t xml:space="preserve"> </w:t>
+      </w:r>
+      <w:r>
+        <w:rPr>
+          <w:sz w:val="21"/>
+          <w:szCs w:val="21"/>
+        </w:rPr>
         <w:lastRenderedPageBreak/>
-        <w:t xml:space="preserve">k-Shape Clustering Algorithm: k-Shape is a </w:t>
-      </w:r>
-      <w:proofErr w:type="spellStart"/>
-      <w:r>
-        <w:rPr>
-          <w:sz w:val="21"/>
-          <w:szCs w:val="21"/>
-        </w:rPr>
-        <w:t>partitionalclustering</w:t>
-      </w:r>
-      <w:proofErr w:type="spellEnd"/>
-      <w:r>
-        <w:rPr>
-          <w:sz w:val="21"/>
-          <w:szCs w:val="21"/>
-        </w:rPr>
-        <w:t xml:space="preserve"> method that is based on an iterative </w:t>
-      </w:r>
-      <w:proofErr w:type="spellStart"/>
-      <w:r>
-        <w:rPr>
-          <w:sz w:val="21"/>
-          <w:szCs w:val="21"/>
-        </w:rPr>
-        <w:t>reﬁnementprocedure</w:t>
-      </w:r>
-      <w:proofErr w:type="spellEnd"/>
-      <w:r>
-        <w:rPr>
-          <w:sz w:val="21"/>
-          <w:szCs w:val="21"/>
-        </w:rPr>
-        <w:t xml:space="preserve"> </w:t>
-      </w:r>
-      <w:proofErr w:type="gramStart"/>
-      <w:r>
-        <w:rPr>
-          <w:sz w:val="21"/>
-          <w:szCs w:val="21"/>
-        </w:rPr>
-        <w:t>similar to</w:t>
-      </w:r>
-      <w:proofErr w:type="gramEnd"/>
-      <w:r>
-        <w:rPr>
-          <w:sz w:val="21"/>
-          <w:szCs w:val="21"/>
-        </w:rPr>
-        <w:t xml:space="preserve"> the one used in k-means. Through </w:t>
-      </w:r>
-      <w:proofErr w:type="spellStart"/>
-      <w:r>
-        <w:rPr>
-          <w:sz w:val="21"/>
-          <w:szCs w:val="21"/>
-        </w:rPr>
-        <w:t>thisiterative</w:t>
-      </w:r>
-      <w:proofErr w:type="spellEnd"/>
-      <w:r>
-        <w:rPr>
-          <w:sz w:val="21"/>
-          <w:szCs w:val="21"/>
-        </w:rPr>
-        <w:t xml:space="preserve"> procedure, k-Shape minimizes the sum of </w:t>
-      </w:r>
-      <w:proofErr w:type="spellStart"/>
-      <w:r>
-        <w:rPr>
-          <w:sz w:val="21"/>
-          <w:szCs w:val="21"/>
-        </w:rPr>
-        <w:t>squareddistances</w:t>
-      </w:r>
-      <w:proofErr w:type="spellEnd"/>
-      <w:r>
-        <w:rPr>
-          <w:sz w:val="21"/>
-          <w:szCs w:val="21"/>
-        </w:rPr>
-        <w:t xml:space="preserve"> (Equation 1) and manages to: (</w:t>
-      </w:r>
-      <w:proofErr w:type="spellStart"/>
-      <w:r>
-        <w:rPr>
-          <w:sz w:val="21"/>
-          <w:szCs w:val="21"/>
-        </w:rPr>
-        <w:t>i</w:t>
-      </w:r>
-      <w:proofErr w:type="spellEnd"/>
-      <w:r>
-        <w:rPr>
-          <w:sz w:val="21"/>
-          <w:szCs w:val="21"/>
-        </w:rPr>
-        <w:t>) produce homo-</w:t>
-      </w:r>
-      <w:proofErr w:type="spellStart"/>
-      <w:r>
-        <w:rPr>
-          <w:sz w:val="21"/>
-          <w:szCs w:val="21"/>
-        </w:rPr>
-        <w:t>geneous</w:t>
-      </w:r>
-      <w:proofErr w:type="spellEnd"/>
-      <w:r>
-        <w:rPr>
-          <w:sz w:val="21"/>
-          <w:szCs w:val="21"/>
-        </w:rPr>
-        <w:t xml:space="preserve"> and well-separated clusters, and (ii) scale </w:t>
-      </w:r>
-      <w:proofErr w:type="spellStart"/>
-      <w:r>
-        <w:rPr>
-          <w:sz w:val="21"/>
-          <w:szCs w:val="21"/>
-        </w:rPr>
-        <w:t>linearlywith</w:t>
-      </w:r>
-      <w:proofErr w:type="spellEnd"/>
-      <w:r>
-        <w:rPr>
-          <w:sz w:val="21"/>
-          <w:szCs w:val="21"/>
-        </w:rPr>
-        <w:t xml:space="preserve"> the number of time series. Our algorithm compares se-</w:t>
-      </w:r>
-      <w:proofErr w:type="spellStart"/>
-      <w:r>
-        <w:rPr>
-          <w:sz w:val="21"/>
-          <w:szCs w:val="21"/>
-        </w:rPr>
-        <w:t>quences</w:t>
-      </w:r>
-      <w:proofErr w:type="spellEnd"/>
-      <w:r>
-        <w:rPr>
-          <w:sz w:val="21"/>
-          <w:szCs w:val="21"/>
-        </w:rPr>
-        <w:t xml:space="preserve"> e</w:t>
-      </w:r>
-      <w:r>
-        <w:rPr>
-          <w:rFonts w:ascii="Cambria Math" w:hAnsi="Cambria Math" w:cs="Cambria Math"/>
-          <w:sz w:val="21"/>
-          <w:szCs w:val="21"/>
-        </w:rPr>
-        <w:t>ﬃ</w:t>
-      </w:r>
-      <w:r>
-        <w:rPr>
-          <w:sz w:val="21"/>
-          <w:szCs w:val="21"/>
-        </w:rPr>
-        <w:t>ciently and computes centroids e</w:t>
-      </w:r>
-      <w:r>
-        <w:rPr>
-          <w:rFonts w:ascii="Cambria Math" w:hAnsi="Cambria Math" w:cs="Cambria Math"/>
-          <w:sz w:val="21"/>
-          <w:szCs w:val="21"/>
-        </w:rPr>
-        <w:t>ﬀ</w:t>
-      </w:r>
-      <w:r>
-        <w:rPr>
-          <w:sz w:val="21"/>
-          <w:szCs w:val="21"/>
-        </w:rPr>
-        <w:t xml:space="preserve">ectively </w:t>
-      </w:r>
-      <w:proofErr w:type="spellStart"/>
-      <w:r>
-        <w:rPr>
-          <w:sz w:val="21"/>
-          <w:szCs w:val="21"/>
-        </w:rPr>
-        <w:t>underthe</w:t>
-      </w:r>
-      <w:proofErr w:type="spellEnd"/>
-      <w:r>
-        <w:rPr>
-          <w:sz w:val="21"/>
-          <w:szCs w:val="21"/>
-        </w:rPr>
-        <w:t xml:space="preserve"> scaling-, translation-, and shift invariances. k-Shape is </w:t>
-      </w:r>
-      <w:proofErr w:type="spellStart"/>
-      <w:r>
-        <w:rPr>
-          <w:sz w:val="21"/>
-          <w:szCs w:val="21"/>
-        </w:rPr>
-        <w:t>anon</w:t>
-      </w:r>
-      <w:proofErr w:type="spellEnd"/>
-      <w:r>
-        <w:rPr>
-          <w:sz w:val="21"/>
-          <w:szCs w:val="21"/>
-        </w:rPr>
-        <w:t>-trivial instantiation of k-means and, in contrast to sim-</w:t>
-      </w:r>
-      <w:proofErr w:type="spellStart"/>
-      <w:r>
-        <w:rPr>
-          <w:sz w:val="21"/>
-          <w:szCs w:val="21"/>
-        </w:rPr>
-        <w:t>ilar</w:t>
-      </w:r>
-      <w:proofErr w:type="spellEnd"/>
-      <w:r>
-        <w:rPr>
-          <w:sz w:val="21"/>
-          <w:szCs w:val="21"/>
-        </w:rPr>
-        <w:t xml:space="preserve"> attempts in the literature [64, 87], its distance </w:t>
-      </w:r>
-      <w:proofErr w:type="spellStart"/>
-      <w:r>
-        <w:rPr>
-          <w:sz w:val="21"/>
-          <w:szCs w:val="21"/>
-        </w:rPr>
-        <w:t>measureand</w:t>
-      </w:r>
-      <w:proofErr w:type="spellEnd"/>
-      <w:r>
-        <w:rPr>
-          <w:sz w:val="21"/>
-          <w:szCs w:val="21"/>
-        </w:rPr>
-        <w:t xml:space="preserve"> centroid computation method make k-Shape the </w:t>
-      </w:r>
-      <w:proofErr w:type="spellStart"/>
-      <w:r>
-        <w:rPr>
-          <w:sz w:val="21"/>
-          <w:szCs w:val="21"/>
-        </w:rPr>
-        <w:t>onlyscalable</w:t>
-      </w:r>
-      <w:proofErr w:type="spellEnd"/>
-      <w:r>
-        <w:rPr>
-          <w:sz w:val="21"/>
-          <w:szCs w:val="21"/>
-        </w:rPr>
-        <w:t xml:space="preserve"> method that signiﬁcantly outperforms k-</w:t>
+        <w:t>method that signiﬁcantly outperforms k-</w:t>
       </w:r>
       <w:proofErr w:type="spellStart"/>
       <w:r>

</xml_diff>